<commit_message>
update Readme.md,  minor edits
</commit_message>
<xml_diff>
--- a/Отчет.docx
+++ b/Отчет.docx
@@ -12,6 +12,72 @@
           <w:szCs w:val="28"/>
         </w:rPr>
       </w:pPr>
+      <w:r>
+        <w:rPr>
+          <w:rFonts w:ascii="Times New Roman" w:hAnsi="Times New Roman" w:cs="Times New Roman"/>
+          <w:b/>
+          <w:bCs/>
+          <w:noProof/>
+          <w:sz w:val="28"/>
+          <w:szCs w:val="28"/>
+          <w:lang w:eastAsia="ru-RU"/>
+        </w:rPr>
+        <w:drawing>
+          <wp:anchor distT="0" distB="0" distL="114300" distR="114300" simplePos="0" relativeHeight="251658240" behindDoc="1" locked="0" layoutInCell="1" allowOverlap="1" wp14:anchorId="1F3396DC" wp14:editId="72BDDFE8">
+            <wp:simplePos x="0" y="0"/>
+            <wp:positionH relativeFrom="page">
+              <wp:align>right</wp:align>
+            </wp:positionH>
+            <wp:positionV relativeFrom="paragraph">
+              <wp:posOffset>-858901</wp:posOffset>
+            </wp:positionV>
+            <wp:extent cx="7562875" cy="10965115"/>
+            <wp:effectExtent l="0" t="0" r="0" b="8255"/>
+            <wp:wrapNone/>
+            <wp:docPr id="2" name="Рисунок 2"/>
+            <wp:cNvGraphicFramePr>
+              <a:graphicFrameLocks xmlns:a="http://schemas.openxmlformats.org/drawingml/2006/main" noChangeAspect="1"/>
+            </wp:cNvGraphicFramePr>
+            <a:graphic xmlns:a="http://schemas.openxmlformats.org/drawingml/2006/main">
+              <a:graphicData uri="http://schemas.openxmlformats.org/drawingml/2006/picture">
+                <pic:pic xmlns:pic="http://schemas.openxmlformats.org/drawingml/2006/picture">
+                  <pic:nvPicPr>
+                    <pic:cNvPr id="2" name="Титульный лист - Эксплуатационная практика1-1.png"/>
+                    <pic:cNvPicPr/>
+                  </pic:nvPicPr>
+                  <pic:blipFill>
+                    <a:blip r:embed="rId8" cstate="print">
+                      <a:extLst>
+                        <a:ext uri="{28A0092B-C50C-407E-A947-70E740481C1C}">
+                          <a14:useLocalDpi xmlns:a14="http://schemas.microsoft.com/office/drawing/2010/main" val="0"/>
+                        </a:ext>
+                      </a:extLst>
+                    </a:blip>
+                    <a:stretch>
+                      <a:fillRect/>
+                    </a:stretch>
+                  </pic:blipFill>
+                  <pic:spPr>
+                    <a:xfrm>
+                      <a:off x="0" y="0"/>
+                      <a:ext cx="7562875" cy="10965115"/>
+                    </a:xfrm>
+                    <a:prstGeom prst="rect">
+                      <a:avLst/>
+                    </a:prstGeom>
+                  </pic:spPr>
+                </pic:pic>
+              </a:graphicData>
+            </a:graphic>
+            <wp14:sizeRelH relativeFrom="margin">
+              <wp14:pctWidth>0</wp14:pctWidth>
+            </wp14:sizeRelH>
+            <wp14:sizeRelV relativeFrom="margin">
+              <wp14:pctHeight>0</wp14:pctHeight>
+            </wp14:sizeRelV>
+          </wp:anchor>
+        </w:drawing>
+      </w:r>
       <w:r>
         <w:rPr>
           <w:rFonts w:ascii="Times New Roman" w:hAnsi="Times New Roman" w:cs="Times New Roman"/>
@@ -1300,16 +1366,6 @@
           <w:lang w:eastAsia="ru-RU"/>
         </w:rPr>
       </w:pPr>
-    </w:p>
-    <w:p>
-      <w:pPr>
-        <w:rPr>
-          <w:rFonts w:ascii="Times New Roman" w:hAnsi="Times New Roman" w:cs="Times New Roman"/>
-          <w:sz w:val="28"/>
-          <w:szCs w:val="28"/>
-          <w:lang w:eastAsia="ru-RU"/>
-        </w:rPr>
-      </w:pPr>
       <w:r>
         <w:rPr>
           <w:rFonts w:ascii="Times New Roman" w:hAnsi="Times New Roman" w:cs="Times New Roman"/>
@@ -1345,20 +1401,23 @@
     <w:p/>
     <w:p/>
     <w:p/>
+    <w:p>
+      <w:pPr>
+        <w:pStyle w:val="1"/>
+        <w:rPr>
+          <w:rFonts w:asciiTheme="minorHAnsi" w:eastAsiaTheme="minorHAnsi" w:hAnsiTheme="minorHAnsi" w:cstheme="minorBidi"/>
+          <w:color w:val="auto"/>
+          <w:sz w:val="24"/>
+          <w:szCs w:val="24"/>
+        </w:rPr>
+      </w:pPr>
+      <w:bookmarkStart w:id="1" w:name="_Toc230224530"/>
+    </w:p>
     <w:p/>
     <w:p/>
     <w:p>
       <w:pPr>
         <w:pStyle w:val="1"/>
-        <w:rPr>
-          <w:rFonts w:ascii="Times New Roman" w:eastAsia="Times New Roman" w:hAnsi="Times New Roman" w:cs="Times New Roman"/>
-          <w:color w:val="F9FAFB"/>
-          <w:kern w:val="0"/>
-          <w:sz w:val="28"/>
-          <w:szCs w:val="28"/>
-          <w:lang w:eastAsia="ru-RU"/>
-          <w14:ligatures w14:val="none"/>
-        </w:rPr>
       </w:pPr>
       <w:r>
         <w:lastRenderedPageBreak/>
@@ -1370,15 +1429,25 @@
       <w:r>
         <w:tab/>
       </w:r>
-      <w:bookmarkStart w:id="1" w:name="_Toc230224530"/>
+      <w:r>
+        <w:tab/>
+      </w:r>
       <w:r>
         <w:t>1. Постановка задачи</w:t>
       </w:r>
+      <w:bookmarkStart w:id="2" w:name="_Toc230224531"/>
       <w:bookmarkEnd w:id="1"/>
     </w:p>
     <w:p>
       <w:pPr>
         <w:rPr>
+          <w:lang w:eastAsia="ru-RU"/>
+        </w:rPr>
+      </w:pPr>
+    </w:p>
+    <w:p>
+      <w:pPr>
+        <w:rPr>
           <w:rFonts w:ascii="Times New Roman" w:hAnsi="Times New Roman" w:cs="Times New Roman"/>
           <w:sz w:val="28"/>
           <w:szCs w:val="28"/>
@@ -1441,7 +1510,41 @@
           <w:sz w:val="28"/>
           <w:szCs w:val="28"/>
         </w:rPr>
-        <w:t>4. Находит предложения, содержащие:</w:t>
+        <w:t>4. Извлекает авторов с первой страницы с помощью библиотеки Natasha.</w:t>
+      </w:r>
+    </w:p>
+    <w:p>
+      <w:pPr>
+        <w:rPr>
+          <w:rFonts w:ascii="Times New Roman" w:hAnsi="Times New Roman" w:cs="Times New Roman"/>
+          <w:sz w:val="28"/>
+          <w:szCs w:val="28"/>
+        </w:rPr>
+      </w:pPr>
+      <w:r>
+        <w:rPr>
+          <w:rFonts w:ascii="Times New Roman" w:hAnsi="Times New Roman" w:cs="Times New Roman"/>
+          <w:sz w:val="28"/>
+          <w:szCs w:val="28"/>
+        </w:rPr>
+        <w:t>5. Распознаёт математические формулы в LaTeX с помощью Pix2Text.</w:t>
+      </w:r>
+    </w:p>
+    <w:p>
+      <w:pPr>
+        <w:rPr>
+          <w:rFonts w:ascii="Times New Roman" w:hAnsi="Times New Roman" w:cs="Times New Roman"/>
+          <w:sz w:val="28"/>
+          <w:szCs w:val="28"/>
+        </w:rPr>
+      </w:pPr>
+      <w:r>
+        <w:rPr>
+          <w:rFonts w:ascii="Times New Roman" w:hAnsi="Times New Roman" w:cs="Times New Roman"/>
+          <w:sz w:val="28"/>
+          <w:szCs w:val="28"/>
+        </w:rPr>
+        <w:t>6. Находит предложения, содержащие:</w:t>
       </w:r>
     </w:p>
     <w:p>
@@ -1475,41 +1578,75 @@
           <w:sz w:val="28"/>
           <w:szCs w:val="28"/>
         </w:rPr>
-        <w:t xml:space="preserve">   - любые словоформы слова «критерий» (однокоренные слова с корнем «критер»).</w:t>
-      </w:r>
-    </w:p>
-    <w:p>
-      <w:pPr>
-        <w:rPr>
-          <w:rFonts w:ascii="Times New Roman" w:hAnsi="Times New Roman" w:cs="Times New Roman"/>
-          <w:sz w:val="28"/>
-          <w:szCs w:val="28"/>
-        </w:rPr>
-      </w:pPr>
-      <w:r>
-        <w:rPr>
-          <w:rFonts w:ascii="Times New Roman" w:hAnsi="Times New Roman" w:cs="Times New Roman"/>
-          <w:sz w:val="28"/>
-          <w:szCs w:val="28"/>
-        </w:rPr>
-        <w:t>5. Формирует контекст: если маркерное предложение короткое (&lt;10 слов), берутся до 2 предыдущих и 1 следующее предложение (с исключением служебных фраз типа «Доказательство», «Теорема»). Если длинное (≥10 слов) — только маркерное предложение.</w:t>
-      </w:r>
-    </w:p>
-    <w:p>
-      <w:pPr>
-        <w:rPr>
-          <w:rFonts w:ascii="Times New Roman" w:hAnsi="Times New Roman" w:cs="Times New Roman"/>
-          <w:sz w:val="28"/>
-          <w:szCs w:val="28"/>
-        </w:rPr>
-      </w:pPr>
-      <w:r>
-        <w:rPr>
-          <w:rFonts w:ascii="Times New Roman" w:hAnsi="Times New Roman" w:cs="Times New Roman"/>
-          <w:sz w:val="28"/>
-          <w:szCs w:val="28"/>
-        </w:rPr>
-        <w:t>6. Сохраняет в выходной JSON-файл для каждого найденного маркера:</w:t>
+        <w:t>- любые словоформы слова «критерий» (однокоренные слова с корнем «критер»).</w:t>
+      </w:r>
+    </w:p>
+    <w:p>
+      <w:pPr>
+        <w:rPr>
+          <w:rFonts w:ascii="Times New Roman" w:hAnsi="Times New Roman" w:cs="Times New Roman"/>
+          <w:sz w:val="28"/>
+          <w:szCs w:val="28"/>
+        </w:rPr>
+      </w:pPr>
+      <w:r>
+        <w:rPr>
+          <w:rFonts w:ascii="Times New Roman" w:hAnsi="Times New Roman" w:cs="Times New Roman"/>
+          <w:sz w:val="28"/>
+          <w:szCs w:val="28"/>
+        </w:rPr>
+        <w:t>7. Формирует контекст:</w:t>
+      </w:r>
+    </w:p>
+    <w:p>
+      <w:pPr>
+        <w:rPr>
+          <w:rFonts w:ascii="Times New Roman" w:hAnsi="Times New Roman" w:cs="Times New Roman"/>
+          <w:sz w:val="28"/>
+          <w:szCs w:val="28"/>
+        </w:rPr>
+      </w:pPr>
+      <w:r>
+        <w:rPr>
+          <w:rFonts w:ascii="Times New Roman" w:hAnsi="Times New Roman" w:cs="Times New Roman"/>
+          <w:sz w:val="28"/>
+          <w:szCs w:val="28"/>
+        </w:rPr>
+        <w:t xml:space="preserve">   - для маркера «тогда и только тогда»: если предложение длинное (≥15 слов) — только оно; если короткое — берутся до 2 предыдущих и 1 следующее (с исключением служебных фраз типа «Доказательство», «Теорема»);</w:t>
+      </w:r>
+    </w:p>
+    <w:p>
+      <w:pPr>
+        <w:rPr>
+          <w:rFonts w:ascii="Times New Roman" w:hAnsi="Times New Roman" w:cs="Times New Roman"/>
+          <w:sz w:val="28"/>
+          <w:szCs w:val="28"/>
+        </w:rPr>
+      </w:pPr>
+      <w:r>
+        <w:rPr>
+          <w:rFonts w:ascii="Times New Roman" w:hAnsi="Times New Roman" w:cs="Times New Roman"/>
+          <w:sz w:val="28"/>
+          <w:szCs w:val="28"/>
+        </w:rPr>
+        <w:t xml:space="preserve">   - для маркера «критерий»: порог — 10 слов.</w:t>
+      </w:r>
+    </w:p>
+    <w:p>
+      <w:pPr>
+        <w:rPr>
+          <w:rFonts w:ascii="Times New Roman" w:hAnsi="Times New Roman" w:cs="Times New Roman"/>
+          <w:sz w:val="28"/>
+          <w:szCs w:val="28"/>
+        </w:rPr>
+      </w:pPr>
+      <w:r>
+        <w:rPr>
+          <w:rFonts w:ascii="Times New Roman" w:hAnsi="Times New Roman" w:cs="Times New Roman"/>
+          <w:sz w:val="28"/>
+          <w:szCs w:val="28"/>
+        </w:rPr>
+        <w:t>8. Сохраняет в выходной JSON-файл для каждого найденного маркера:</w:t>
       </w:r>
     </w:p>
     <w:p>
@@ -1543,6 +1680,23 @@
           <w:sz w:val="28"/>
           <w:szCs w:val="28"/>
         </w:rPr>
+        <w:t xml:space="preserve">   - автор;</w:t>
+      </w:r>
+    </w:p>
+    <w:p>
+      <w:pPr>
+        <w:rPr>
+          <w:rFonts w:ascii="Times New Roman" w:hAnsi="Times New Roman" w:cs="Times New Roman"/>
+          <w:sz w:val="28"/>
+          <w:szCs w:val="28"/>
+        </w:rPr>
+      </w:pPr>
+      <w:r>
+        <w:rPr>
+          <w:rFonts w:ascii="Times New Roman" w:hAnsi="Times New Roman" w:cs="Times New Roman"/>
+          <w:sz w:val="28"/>
+          <w:szCs w:val="28"/>
+        </w:rPr>
         <w:t xml:space="preserve">   - номер страницы;</w:t>
       </w:r>
     </w:p>
@@ -1577,6 +1731,23 @@
           <w:sz w:val="28"/>
           <w:szCs w:val="28"/>
         </w:rPr>
+        <w:t xml:space="preserve">   - распознанная формула (LaTeX);</w:t>
+      </w:r>
+    </w:p>
+    <w:p>
+      <w:pPr>
+        <w:rPr>
+          <w:rFonts w:ascii="Times New Roman" w:hAnsi="Times New Roman" w:cs="Times New Roman"/>
+          <w:sz w:val="28"/>
+          <w:szCs w:val="28"/>
+        </w:rPr>
+      </w:pPr>
+      <w:r>
+        <w:rPr>
+          <w:rFonts w:ascii="Times New Roman" w:hAnsi="Times New Roman" w:cs="Times New Roman"/>
+          <w:sz w:val="28"/>
+          <w:szCs w:val="28"/>
+        </w:rPr>
         <w:t xml:space="preserve">   - тип маркера.</w:t>
       </w:r>
     </w:p>
@@ -1594,15 +1765,38 @@
           <w:sz w:val="28"/>
           <w:szCs w:val="28"/>
         </w:rPr>
-        <w:t>7. Подсчитывает общую статистику встречаемости маркеров.</w:t>
-      </w:r>
-    </w:p>
+        <w:t>9. Подсчитывает общую статистику встречаемости маркеров по всем файлам и по каждому файлу отдельно.</w:t>
+      </w:r>
+    </w:p>
+    <w:p>
+      <w:pPr>
+        <w:pStyle w:val="HTML"/>
+        <w:wordWrap w:val="0"/>
+        <w:spacing w:line="330" w:lineRule="atLeast"/>
+        <w:rPr>
+          <w:rFonts w:ascii="Times New Roman" w:hAnsi="Times New Roman" w:cs="Times New Roman"/>
+          <w:color w:val="FF0000"/>
+          <w:sz w:val="28"/>
+          <w:szCs w:val="28"/>
+        </w:rPr>
+      </w:pPr>
+      <w:r>
+        <w:rPr>
+          <w:rFonts w:ascii="Times New Roman" w:hAnsi="Times New Roman" w:cs="Times New Roman"/>
+          <w:color w:val="FF0000"/>
+          <w:sz w:val="28"/>
+          <w:szCs w:val="28"/>
+        </w:rPr>
+        <w:br/>
+      </w:r>
+    </w:p>
+    <w:p/>
     <w:p>
       <w:pPr>
         <w:pStyle w:val="1"/>
       </w:pPr>
-      <w:bookmarkStart w:id="2" w:name="_Toc230224531"/>
-      <w:r>
+      <w:r>
+        <w:lastRenderedPageBreak/>
         <w:t>2. Этапы разработки и реализация</w:t>
       </w:r>
       <w:bookmarkEnd w:id="2"/>
@@ -1899,7 +2093,6 @@
         </w:rPr>
         <w:t xml:space="preserve">для распознавания формул в </w:t>
       </w:r>
-      <w:proofErr w:type="spellStart"/>
       <w:r>
         <w:rPr>
           <w:rFonts w:ascii="Times New Roman" w:hAnsi="Times New Roman" w:cs="Times New Roman"/>
@@ -1909,7 +2102,6 @@
         </w:rPr>
         <w:t>LaTex</w:t>
       </w:r>
-      <w:proofErr w:type="spellEnd"/>
       <w:r>
         <w:rPr>
           <w:rFonts w:ascii="Times New Roman" w:hAnsi="Times New Roman" w:cs="Times New Roman"/>
@@ -1979,7 +2171,6 @@
           <w:sz w:val="28"/>
           <w:szCs w:val="28"/>
         </w:rPr>
-        <w:lastRenderedPageBreak/>
         <w:t>re</w:t>
       </w:r>
       <w:r>
@@ -2051,23 +2242,7 @@
           <w:rFonts w:ascii="Times New Roman" w:hAnsi="Times New Roman" w:cs="Times New Roman"/>
           <w:sz w:val="28"/>
         </w:rPr>
-        <w:t>Извлечение текста выполняется функцией `</w:t>
-      </w:r>
-      <w:proofErr w:type="gramStart"/>
-      <w:r>
-        <w:rPr>
-          <w:rFonts w:ascii="Times New Roman" w:hAnsi="Times New Roman" w:cs="Times New Roman"/>
-          <w:sz w:val="28"/>
-        </w:rPr>
-        <w:t>page.extract</w:t>
-      </w:r>
-      <w:proofErr w:type="gramEnd"/>
-      <w:r>
-        <w:rPr>
-          <w:rFonts w:ascii="Times New Roman" w:hAnsi="Times New Roman" w:cs="Times New Roman"/>
-          <w:sz w:val="28"/>
-        </w:rPr>
-        <w:t>_text()` библиотеки `pypdf`. Далее текст очищается:</w:t>
+        <w:t>Извлечение текста выполняется функцией `page.extract_text()` библиотеки `pypdf`. Далее текст очищается:</w:t>
       </w:r>
     </w:p>
     <w:p>
@@ -2119,25 +2294,7 @@
           <w:rFonts w:ascii="Times New Roman" w:hAnsi="Times New Roman" w:cs="Times New Roman"/>
           <w:sz w:val="28"/>
         </w:rPr>
-        <w:t>роки (`</w:t>
-      </w:r>
-      <w:proofErr w:type="spellStart"/>
-      <w:proofErr w:type="gramStart"/>
-      <w:r>
-        <w:rPr>
-          <w:rFonts w:ascii="Times New Roman" w:hAnsi="Times New Roman" w:cs="Times New Roman"/>
-          <w:sz w:val="28"/>
-        </w:rPr>
-        <w:t>кри-терий</w:t>
-      </w:r>
-      <w:proofErr w:type="spellEnd"/>
-      <w:proofErr w:type="gramEnd"/>
-      <w:r>
-        <w:rPr>
-          <w:rFonts w:ascii="Times New Roman" w:hAnsi="Times New Roman" w:cs="Times New Roman"/>
-          <w:sz w:val="28"/>
-        </w:rPr>
-        <w:t>` → `критерий`)</w:t>
+        <w:t>роки (`кри-терий` → `критерий`)</w:t>
       </w:r>
     </w:p>
     <w:p>
@@ -2194,7 +2351,12 @@
         <w:t xml:space="preserve">2.3 </w:t>
       </w:r>
       <w:r>
-        <w:t>Поиск маркеров и формирование контекста</w:t>
+        <w:t>Поиск маркеров и формирование</w:t>
+      </w:r>
+      <w:bookmarkStart w:id="6" w:name="_GoBack"/>
+      <w:bookmarkEnd w:id="6"/>
+      <w:r>
+        <w:t xml:space="preserve"> контекста</w:t>
       </w:r>
       <w:bookmarkEnd w:id="5"/>
     </w:p>
@@ -2208,7 +2370,7 @@
           <w:szCs w:val="24"/>
         </w:rPr>
       </w:pPr>
-      <w:bookmarkStart w:id="6" w:name="_Toc230224535"/>
+      <w:bookmarkStart w:id="7" w:name="_Toc230224535"/>
       <w:r>
         <w:rPr>
           <w:rFonts w:ascii="Times New Roman" w:eastAsiaTheme="minorHAnsi" w:hAnsi="Times New Roman" w:cs="Times New Roman"/>
@@ -2236,19 +2398,19 @@
           <w:sz w:val="28"/>
           <w:szCs w:val="24"/>
         </w:rPr>
-        <w:t>- `тогда\</w:t>
-      </w:r>
-      <w:proofErr w:type="spellStart"/>
-      <w:r>
+        <w:t>- `тогда\s+и\s+только\s+тогда` — для поиска эквивалентностей</w:t>
+      </w:r>
+    </w:p>
+    <w:p>
+      <w:pPr>
+        <w:pStyle w:val="2"/>
         <w:rPr>
           <w:rFonts w:ascii="Times New Roman" w:eastAsiaTheme="minorHAnsi" w:hAnsi="Times New Roman" w:cs="Times New Roman"/>
           <w:color w:val="auto"/>
           <w:sz w:val="28"/>
           <w:szCs w:val="24"/>
         </w:rPr>
-        <w:t>s+и</w:t>
-      </w:r>
-      <w:proofErr w:type="spellEnd"/>
+      </w:pPr>
       <w:r>
         <w:rPr>
           <w:rFonts w:ascii="Times New Roman" w:eastAsiaTheme="minorHAnsi" w:hAnsi="Times New Roman" w:cs="Times New Roman"/>
@@ -2256,19 +2418,19 @@
           <w:sz w:val="28"/>
           <w:szCs w:val="24"/>
         </w:rPr>
-        <w:t>\</w:t>
-      </w:r>
-      <w:proofErr w:type="spellStart"/>
-      <w:r>
+        <w:t>- `критери[яйюеи]?[м]?\b` — для поиска слова «критерий» в любом склонении</w:t>
+      </w:r>
+    </w:p>
+    <w:p>
+      <w:pPr>
+        <w:pStyle w:val="2"/>
         <w:rPr>
           <w:rFonts w:ascii="Times New Roman" w:eastAsiaTheme="minorHAnsi" w:hAnsi="Times New Roman" w:cs="Times New Roman"/>
           <w:color w:val="auto"/>
           <w:sz w:val="28"/>
           <w:szCs w:val="24"/>
         </w:rPr>
-        <w:t>s+только</w:t>
-      </w:r>
-      <w:proofErr w:type="spellEnd"/>
+      </w:pPr>
       <w:r>
         <w:rPr>
           <w:rFonts w:ascii="Times New Roman" w:eastAsiaTheme="minorHAnsi" w:hAnsi="Times New Roman" w:cs="Times New Roman"/>
@@ -2276,19 +2438,19 @@
           <w:sz w:val="28"/>
           <w:szCs w:val="24"/>
         </w:rPr>
-        <w:t>\</w:t>
-      </w:r>
-      <w:proofErr w:type="spellStart"/>
-      <w:r>
+        <w:t>Контекст формируется по гибкому алгоритму:</w:t>
+      </w:r>
+    </w:p>
+    <w:p>
+      <w:pPr>
+        <w:pStyle w:val="2"/>
         <w:rPr>
           <w:rFonts w:ascii="Times New Roman" w:eastAsiaTheme="minorHAnsi" w:hAnsi="Times New Roman" w:cs="Times New Roman"/>
           <w:color w:val="auto"/>
           <w:sz w:val="28"/>
           <w:szCs w:val="24"/>
         </w:rPr>
-        <w:t>s+тогда</w:t>
-      </w:r>
-      <w:proofErr w:type="spellEnd"/>
+      </w:pPr>
       <w:r>
         <w:rPr>
           <w:rFonts w:ascii="Times New Roman" w:eastAsiaTheme="minorHAnsi" w:hAnsi="Times New Roman" w:cs="Times New Roman"/>
@@ -2296,7 +2458,7 @@
           <w:sz w:val="28"/>
           <w:szCs w:val="24"/>
         </w:rPr>
-        <w:t>` — для поиска эквивалентностей</w:t>
+        <w:t>1. Предложение с маркером разбивается на слова.</w:t>
       </w:r>
     </w:p>
     <w:p>
@@ -2316,19 +2478,19 @@
           <w:sz w:val="28"/>
           <w:szCs w:val="24"/>
         </w:rPr>
-        <w:t>- `</w:t>
-      </w:r>
-      <w:proofErr w:type="spellStart"/>
-      <w:r>
+        <w:t xml:space="preserve">   - Для маркера «тогда и только тогда»: если в нём 15 и более слов, в контекст попадает только оно.</w:t>
+      </w:r>
+    </w:p>
+    <w:p>
+      <w:pPr>
+        <w:pStyle w:val="2"/>
         <w:rPr>
           <w:rFonts w:ascii="Times New Roman" w:eastAsiaTheme="minorHAnsi" w:hAnsi="Times New Roman" w:cs="Times New Roman"/>
           <w:color w:val="auto"/>
           <w:sz w:val="28"/>
           <w:szCs w:val="24"/>
         </w:rPr>
-        <w:t>критери</w:t>
-      </w:r>
-      <w:proofErr w:type="spellEnd"/>
+      </w:pPr>
       <w:r>
         <w:rPr>
           <w:rFonts w:ascii="Times New Roman" w:eastAsiaTheme="minorHAnsi" w:hAnsi="Times New Roman" w:cs="Times New Roman"/>
@@ -2336,20 +2498,19 @@
           <w:sz w:val="28"/>
           <w:szCs w:val="24"/>
         </w:rPr>
-        <w:t>[</w:t>
-      </w:r>
-      <w:proofErr w:type="spellStart"/>
-      <w:r>
+        <w:t xml:space="preserve">   - Для маркера «критерий»: если в нём 10 и более слов, в контекст попадает только оно.</w:t>
+      </w:r>
+    </w:p>
+    <w:p>
+      <w:pPr>
+        <w:pStyle w:val="2"/>
         <w:rPr>
           <w:rFonts w:ascii="Times New Roman" w:eastAsiaTheme="minorHAnsi" w:hAnsi="Times New Roman" w:cs="Times New Roman"/>
           <w:color w:val="auto"/>
           <w:sz w:val="28"/>
           <w:szCs w:val="24"/>
         </w:rPr>
-        <w:t>яйюеи</w:t>
-      </w:r>
-      <w:proofErr w:type="spellEnd"/>
-      <w:proofErr w:type="gramStart"/>
+      </w:pPr>
       <w:r>
         <w:rPr>
           <w:rFonts w:ascii="Times New Roman" w:eastAsiaTheme="minorHAnsi" w:hAnsi="Times New Roman" w:cs="Times New Roman"/>
@@ -2357,262 +2518,132 @@
           <w:sz w:val="28"/>
           <w:szCs w:val="24"/>
         </w:rPr>
-        <w:t>]?[</w:t>
-      </w:r>
-      <w:proofErr w:type="gramEnd"/>
-      <w:r>
+        <w:t>2. Если предложение короче указанных порогов, берутся:</w:t>
+      </w:r>
+    </w:p>
+    <w:p>
+      <w:pPr>
+        <w:pStyle w:val="2"/>
         <w:rPr>
           <w:rFonts w:ascii="Times New Roman" w:eastAsiaTheme="minorHAnsi" w:hAnsi="Times New Roman" w:cs="Times New Roman"/>
           <w:color w:val="auto"/>
           <w:sz w:val="28"/>
           <w:szCs w:val="24"/>
         </w:rPr>
-        <w:t>м]?\b` — для поиска слова «критерий» в любом склонении</w:t>
-      </w:r>
-    </w:p>
-    <w:p>
-      <w:pPr>
-        <w:pStyle w:val="2"/>
+      </w:pPr>
+      <w:r>
         <w:rPr>
           <w:rFonts w:ascii="Times New Roman" w:eastAsiaTheme="minorHAnsi" w:hAnsi="Times New Roman" w:cs="Times New Roman"/>
           <w:color w:val="auto"/>
           <w:sz w:val="28"/>
           <w:szCs w:val="24"/>
         </w:rPr>
-      </w:pPr>
-      <w:r>
+        <w:t xml:space="preserve">   - до 2 предложений перед ним (при наличии)</w:t>
+      </w:r>
+    </w:p>
+    <w:p>
+      <w:pPr>
+        <w:pStyle w:val="2"/>
         <w:rPr>
           <w:rFonts w:ascii="Times New Roman" w:eastAsiaTheme="minorHAnsi" w:hAnsi="Times New Roman" w:cs="Times New Roman"/>
           <w:color w:val="auto"/>
           <w:sz w:val="28"/>
           <w:szCs w:val="24"/>
         </w:rPr>
-        <w:t>Контекст формируется по гибкому алгоритму:</w:t>
-      </w:r>
-    </w:p>
-    <w:p>
-      <w:pPr>
-        <w:pStyle w:val="2"/>
+      </w:pPr>
+      <w:r>
         <w:rPr>
           <w:rFonts w:ascii="Times New Roman" w:eastAsiaTheme="minorHAnsi" w:hAnsi="Times New Roman" w:cs="Times New Roman"/>
           <w:color w:val="auto"/>
           <w:sz w:val="28"/>
           <w:szCs w:val="24"/>
         </w:rPr>
-      </w:pPr>
-      <w:r>
+        <w:t xml:space="preserve">   - само маркерное предложение</w:t>
+      </w:r>
+    </w:p>
+    <w:p>
+      <w:pPr>
+        <w:pStyle w:val="2"/>
         <w:rPr>
           <w:rFonts w:ascii="Times New Roman" w:eastAsiaTheme="minorHAnsi" w:hAnsi="Times New Roman" w:cs="Times New Roman"/>
           <w:color w:val="auto"/>
           <w:sz w:val="28"/>
           <w:szCs w:val="24"/>
         </w:rPr>
-        <w:t>1. Предложение с маркером разбивается на слова.</w:t>
-      </w:r>
-    </w:p>
-    <w:p>
-      <w:pPr>
-        <w:pStyle w:val="2"/>
+      </w:pPr>
+      <w:r>
         <w:rPr>
           <w:rFonts w:ascii="Times New Roman" w:eastAsiaTheme="minorHAnsi" w:hAnsi="Times New Roman" w:cs="Times New Roman"/>
           <w:color w:val="auto"/>
           <w:sz w:val="28"/>
           <w:szCs w:val="24"/>
         </w:rPr>
-      </w:pPr>
-      <w:r>
+        <w:t xml:space="preserve">   - 1 предложение после (при наличии)</w:t>
+      </w:r>
+    </w:p>
+    <w:p>
+      <w:pPr>
+        <w:pStyle w:val="2"/>
         <w:rPr>
           <w:rFonts w:ascii="Times New Roman" w:eastAsiaTheme="minorHAnsi" w:hAnsi="Times New Roman" w:cs="Times New Roman"/>
           <w:color w:val="auto"/>
           <w:sz w:val="28"/>
           <w:szCs w:val="24"/>
         </w:rPr>
-        <w:t xml:space="preserve">   - Для маркера «тогда и только тогда»: если в нём 15 и более слов, в контекст попадает только оно.</w:t>
-      </w:r>
-    </w:p>
-    <w:p>
-      <w:pPr>
-        <w:pStyle w:val="2"/>
+      </w:pPr>
+      <w:r>
         <w:rPr>
           <w:rFonts w:ascii="Times New Roman" w:eastAsiaTheme="minorHAnsi" w:hAnsi="Times New Roman" w:cs="Times New Roman"/>
           <w:color w:val="auto"/>
           <w:sz w:val="28"/>
           <w:szCs w:val="24"/>
         </w:rPr>
-      </w:pPr>
-      <w:r>
+        <w:t xml:space="preserve">3. Следующее предложение не включается, если оно начинается со слов:  </w:t>
+      </w:r>
+    </w:p>
+    <w:p>
+      <w:pPr>
+        <w:pStyle w:val="2"/>
         <w:rPr>
           <w:rFonts w:ascii="Times New Roman" w:eastAsiaTheme="minorHAnsi" w:hAnsi="Times New Roman" w:cs="Times New Roman"/>
           <w:color w:val="auto"/>
           <w:sz w:val="28"/>
           <w:szCs w:val="24"/>
         </w:rPr>
-        <w:t xml:space="preserve">   - Для маркера «критерий»: если в нём 10 и более слов, в контекст попадает только оно.</w:t>
-      </w:r>
-    </w:p>
-    <w:p>
-      <w:pPr>
-        <w:pStyle w:val="2"/>
+      </w:pPr>
+      <w:r>
         <w:rPr>
           <w:rFonts w:ascii="Times New Roman" w:eastAsiaTheme="minorHAnsi" w:hAnsi="Times New Roman" w:cs="Times New Roman"/>
           <w:color w:val="auto"/>
           <w:sz w:val="28"/>
           <w:szCs w:val="24"/>
         </w:rPr>
-      </w:pPr>
-      <w:r>
+        <w:t xml:space="preserve">   `Доказательство`, `Теорема`, `Лемма`, `Таким образом`, `Следовательно`, `Отсюда`, `Заметим`.</w:t>
+      </w:r>
+    </w:p>
+    <w:p>
+      <w:pPr>
+        <w:pStyle w:val="2"/>
         <w:rPr>
           <w:rFonts w:ascii="Times New Roman" w:eastAsiaTheme="minorHAnsi" w:hAnsi="Times New Roman" w:cs="Times New Roman"/>
           <w:color w:val="auto"/>
           <w:sz w:val="28"/>
           <w:szCs w:val="24"/>
         </w:rPr>
-        <w:t>2. Если предложение короче указанных порогов, берутся:</w:t>
-      </w:r>
-    </w:p>
-    <w:p>
-      <w:pPr>
-        <w:pStyle w:val="2"/>
+      </w:pPr>
+      <w:r>
         <w:rPr>
           <w:rFonts w:ascii="Times New Roman" w:eastAsiaTheme="minorHAnsi" w:hAnsi="Times New Roman" w:cs="Times New Roman"/>
           <w:color w:val="auto"/>
           <w:sz w:val="28"/>
           <w:szCs w:val="24"/>
         </w:rPr>
-      </w:pPr>
-      <w:r>
-        <w:rPr>
-          <w:rFonts w:ascii="Times New Roman" w:eastAsiaTheme="minorHAnsi" w:hAnsi="Times New Roman" w:cs="Times New Roman"/>
-          <w:color w:val="auto"/>
-          <w:sz w:val="28"/>
-          <w:szCs w:val="24"/>
-        </w:rPr>
-        <w:t xml:space="preserve">   - до 2 предложений перед ним (при наличии)</w:t>
+        <w:t>Такой подход позволяет получить осмысленный контекст (от 1 до 4 предложений), избегая захвата служебных фраз.</w:t>
       </w:r>
     </w:p>
     <w:p>
       <w:pPr>
         <w:pStyle w:val="2"/>
-        <w:rPr>
-          <w:rFonts w:ascii="Times New Roman" w:eastAsiaTheme="minorHAnsi" w:hAnsi="Times New Roman" w:cs="Times New Roman"/>
-          <w:color w:val="auto"/>
-          <w:sz w:val="28"/>
-          <w:szCs w:val="24"/>
-        </w:rPr>
-      </w:pPr>
-      <w:r>
-        <w:rPr>
-          <w:rFonts w:ascii="Times New Roman" w:eastAsiaTheme="minorHAnsi" w:hAnsi="Times New Roman" w:cs="Times New Roman"/>
-          <w:color w:val="auto"/>
-          <w:sz w:val="28"/>
-          <w:szCs w:val="24"/>
-        </w:rPr>
-        <w:t xml:space="preserve">   - само маркерное предложение</w:t>
-      </w:r>
-    </w:p>
-    <w:p>
-      <w:pPr>
-        <w:pStyle w:val="2"/>
-        <w:rPr>
-          <w:rFonts w:ascii="Times New Roman" w:eastAsiaTheme="minorHAnsi" w:hAnsi="Times New Roman" w:cs="Times New Roman"/>
-          <w:color w:val="auto"/>
-          <w:sz w:val="28"/>
-          <w:szCs w:val="24"/>
-        </w:rPr>
-      </w:pPr>
-      <w:r>
-        <w:rPr>
-          <w:rFonts w:ascii="Times New Roman" w:eastAsiaTheme="minorHAnsi" w:hAnsi="Times New Roman" w:cs="Times New Roman"/>
-          <w:color w:val="auto"/>
-          <w:sz w:val="28"/>
-          <w:szCs w:val="24"/>
-        </w:rPr>
-        <w:t xml:space="preserve">   - 1 предложение после (при наличии)</w:t>
-      </w:r>
-    </w:p>
-    <w:p>
-      <w:pPr>
-        <w:pStyle w:val="2"/>
-        <w:rPr>
-          <w:rFonts w:ascii="Times New Roman" w:eastAsiaTheme="minorHAnsi" w:hAnsi="Times New Roman" w:cs="Times New Roman"/>
-          <w:color w:val="auto"/>
-          <w:sz w:val="28"/>
-          <w:szCs w:val="24"/>
-        </w:rPr>
-      </w:pPr>
-      <w:r>
-        <w:rPr>
-          <w:rFonts w:ascii="Times New Roman" w:eastAsiaTheme="minorHAnsi" w:hAnsi="Times New Roman" w:cs="Times New Roman"/>
-          <w:color w:val="auto"/>
-          <w:sz w:val="28"/>
-          <w:szCs w:val="24"/>
-        </w:rPr>
-        <w:t xml:space="preserve">3. Следующее предложение не включается, если оно начинается со слов:  </w:t>
-      </w:r>
-    </w:p>
-    <w:p>
-      <w:pPr>
-        <w:pStyle w:val="2"/>
-        <w:rPr>
-          <w:rFonts w:ascii="Times New Roman" w:eastAsiaTheme="minorHAnsi" w:hAnsi="Times New Roman" w:cs="Times New Roman"/>
-          <w:color w:val="auto"/>
-          <w:sz w:val="28"/>
-          <w:szCs w:val="24"/>
-        </w:rPr>
-      </w:pPr>
-      <w:r>
-        <w:rPr>
-          <w:rFonts w:ascii="Times New Roman" w:eastAsiaTheme="minorHAnsi" w:hAnsi="Times New Roman" w:cs="Times New Roman"/>
-          <w:color w:val="auto"/>
-          <w:sz w:val="28"/>
-          <w:szCs w:val="24"/>
-        </w:rPr>
-        <w:t xml:space="preserve">   `Доказательство`, `Теорема`, `Лемма`, `Таким образом`, </w:t>
-      </w:r>
-      <w:proofErr w:type="gramStart"/>
-      <w:r>
-        <w:rPr>
-          <w:rFonts w:ascii="Times New Roman" w:eastAsiaTheme="minorHAnsi" w:hAnsi="Times New Roman" w:cs="Times New Roman"/>
-          <w:color w:val="auto"/>
-          <w:sz w:val="28"/>
-          <w:szCs w:val="24"/>
-        </w:rPr>
-        <w:t>`Следовательно</w:t>
-      </w:r>
-      <w:proofErr w:type="gramEnd"/>
-      <w:r>
-        <w:rPr>
-          <w:rFonts w:ascii="Times New Roman" w:eastAsiaTheme="minorHAnsi" w:hAnsi="Times New Roman" w:cs="Times New Roman"/>
-          <w:color w:val="auto"/>
-          <w:sz w:val="28"/>
-          <w:szCs w:val="24"/>
-        </w:rPr>
-        <w:t>`, `Отсюда`, `Заметим`.</w:t>
-      </w:r>
-    </w:p>
-    <w:p>
-      <w:pPr>
-        <w:pStyle w:val="2"/>
-        <w:rPr>
-          <w:rFonts w:ascii="Times New Roman" w:eastAsiaTheme="minorHAnsi" w:hAnsi="Times New Roman" w:cs="Times New Roman"/>
-          <w:color w:val="auto"/>
-          <w:sz w:val="28"/>
-          <w:szCs w:val="24"/>
-        </w:rPr>
-      </w:pPr>
-      <w:r>
-        <w:rPr>
-          <w:rFonts w:ascii="Times New Roman" w:eastAsiaTheme="minorHAnsi" w:hAnsi="Times New Roman" w:cs="Times New Roman"/>
-          <w:color w:val="auto"/>
-          <w:sz w:val="28"/>
-          <w:szCs w:val="24"/>
-        </w:rPr>
-        <w:t>Такой подход позволяет получить осмысленный контекст (от 1 до 4 предложений), избегая захвата служебных фраз.</w:t>
-      </w:r>
-    </w:p>
-    <w:p>
-      <w:pPr>
-        <w:pStyle w:val="2"/>
       </w:pPr>
       <w:r>
         <w:t>2.</w:t>
@@ -2626,7 +2657,7 @@
       <w:r>
         <w:t>Сбор статистики и выходной формат</w:t>
       </w:r>
-      <w:bookmarkEnd w:id="6"/>
+      <w:bookmarkEnd w:id="7"/>
     </w:p>
     <w:p>
       <w:pPr>
@@ -2655,54 +2686,22 @@
           <w:rFonts w:ascii="Times New Roman" w:hAnsi="Times New Roman" w:cs="Times New Roman"/>
           <w:sz w:val="28"/>
         </w:rPr>
-        <w:t>- `</w:t>
-      </w:r>
-      <w:proofErr w:type="spellStart"/>
-      <w:r>
-        <w:rPr>
-          <w:rFonts w:ascii="Times New Roman" w:hAnsi="Times New Roman" w:cs="Times New Roman"/>
-          <w:sz w:val="28"/>
-        </w:rPr>
-        <w:t>total_statistics</w:t>
-      </w:r>
-      <w:proofErr w:type="spellEnd"/>
-      <w:r>
-        <w:rPr>
-          <w:rFonts w:ascii="Times New Roman" w:hAnsi="Times New Roman" w:cs="Times New Roman"/>
-          <w:sz w:val="28"/>
-        </w:rPr>
-        <w:t>` — глобальная статистика по всем файлам</w:t>
-      </w:r>
-    </w:p>
-    <w:p>
-      <w:pPr>
-        <w:rPr>
-          <w:rFonts w:ascii="Times New Roman" w:hAnsi="Times New Roman" w:cs="Times New Roman"/>
-          <w:sz w:val="28"/>
-        </w:rPr>
-      </w:pPr>
-      <w:r>
-        <w:rPr>
-          <w:rFonts w:ascii="Times New Roman" w:hAnsi="Times New Roman" w:cs="Times New Roman"/>
-          <w:sz w:val="28"/>
-        </w:rPr>
-        <w:t>- `</w:t>
-      </w:r>
-      <w:proofErr w:type="spellStart"/>
-      <w:r>
-        <w:rPr>
-          <w:rFonts w:ascii="Times New Roman" w:hAnsi="Times New Roman" w:cs="Times New Roman"/>
-          <w:sz w:val="28"/>
-        </w:rPr>
-        <w:t>files_statistics</w:t>
-      </w:r>
-      <w:proofErr w:type="spellEnd"/>
-      <w:r>
-        <w:rPr>
-          <w:rFonts w:ascii="Times New Roman" w:hAnsi="Times New Roman" w:cs="Times New Roman"/>
-          <w:sz w:val="28"/>
-        </w:rPr>
-        <w:t>` — статистика по каждому файлу</w:t>
+        <w:t>- `total_statistics` — глобальная статистика по всем файлам</w:t>
+      </w:r>
+    </w:p>
+    <w:p>
+      <w:pPr>
+        <w:rPr>
+          <w:rFonts w:ascii="Times New Roman" w:hAnsi="Times New Roman" w:cs="Times New Roman"/>
+          <w:sz w:val="28"/>
+        </w:rPr>
+      </w:pPr>
+      <w:r>
+        <w:rPr>
+          <w:rFonts w:ascii="Times New Roman" w:hAnsi="Times New Roman" w:cs="Times New Roman"/>
+          <w:sz w:val="28"/>
+        </w:rPr>
+        <w:t>- `files_statistics` — статистика по каждому файлу</w:t>
       </w:r>
     </w:p>
     <w:p>
@@ -2732,54 +2731,22 @@
           <w:rFonts w:ascii="Times New Roman" w:hAnsi="Times New Roman" w:cs="Times New Roman"/>
           <w:sz w:val="28"/>
         </w:rPr>
-        <w:t>- `</w:t>
-      </w:r>
-      <w:proofErr w:type="spellStart"/>
-      <w:r>
-        <w:rPr>
-          <w:rFonts w:ascii="Times New Roman" w:hAnsi="Times New Roman" w:cs="Times New Roman"/>
-          <w:sz w:val="28"/>
-        </w:rPr>
-        <w:t>total_statistics</w:t>
-      </w:r>
-      <w:proofErr w:type="spellEnd"/>
-      <w:r>
-        <w:rPr>
-          <w:rFonts w:ascii="Times New Roman" w:hAnsi="Times New Roman" w:cs="Times New Roman"/>
-          <w:sz w:val="28"/>
-        </w:rPr>
-        <w:t>` — общее количество найденных маркеров (отдельно для «тогда и только тогда» и «критерий»)</w:t>
-      </w:r>
-    </w:p>
-    <w:p>
-      <w:pPr>
-        <w:rPr>
-          <w:rFonts w:ascii="Times New Roman" w:hAnsi="Times New Roman" w:cs="Times New Roman"/>
-          <w:sz w:val="28"/>
-        </w:rPr>
-      </w:pPr>
-      <w:r>
-        <w:rPr>
-          <w:rFonts w:ascii="Times New Roman" w:hAnsi="Times New Roman" w:cs="Times New Roman"/>
-          <w:sz w:val="28"/>
-        </w:rPr>
-        <w:t>- `</w:t>
-      </w:r>
-      <w:proofErr w:type="spellStart"/>
-      <w:r>
-        <w:rPr>
-          <w:rFonts w:ascii="Times New Roman" w:hAnsi="Times New Roman" w:cs="Times New Roman"/>
-          <w:sz w:val="28"/>
-        </w:rPr>
-        <w:t>files_statistics</w:t>
-      </w:r>
-      <w:proofErr w:type="spellEnd"/>
-      <w:r>
-        <w:rPr>
-          <w:rFonts w:ascii="Times New Roman" w:hAnsi="Times New Roman" w:cs="Times New Roman"/>
-          <w:sz w:val="28"/>
-        </w:rPr>
-        <w:t>` — статистика по каждому файлу</w:t>
+        <w:t>- `total_statistics` — общее количество найденных маркеров (отдельно для «тогда и только тогда» и «критерий»)</w:t>
+      </w:r>
+    </w:p>
+    <w:p>
+      <w:pPr>
+        <w:rPr>
+          <w:rFonts w:ascii="Times New Roman" w:hAnsi="Times New Roman" w:cs="Times New Roman"/>
+          <w:sz w:val="28"/>
+        </w:rPr>
+      </w:pPr>
+      <w:r>
+        <w:rPr>
+          <w:rFonts w:ascii="Times New Roman" w:hAnsi="Times New Roman" w:cs="Times New Roman"/>
+          <w:sz w:val="28"/>
+        </w:rPr>
+        <w:t>- `files_statistics` — статистика по каждому файлу</w:t>
       </w:r>
     </w:p>
     <w:p>
@@ -2795,34 +2762,18 @@
           <w:sz w:val="28"/>
         </w:rPr>
         <w:lastRenderedPageBreak/>
-        <w:t>- `</w:t>
-      </w:r>
-      <w:proofErr w:type="spellStart"/>
-      <w:r>
-        <w:rPr>
-          <w:rFonts w:ascii="Times New Roman" w:hAnsi="Times New Roman" w:cs="Times New Roman"/>
-          <w:sz w:val="28"/>
-        </w:rPr>
-        <w:t>results</w:t>
-      </w:r>
-      <w:proofErr w:type="spellEnd"/>
-      <w:r>
-        <w:rPr>
-          <w:rFonts w:ascii="Times New Roman" w:hAnsi="Times New Roman" w:cs="Times New Roman"/>
-          <w:sz w:val="28"/>
-        </w:rPr>
-        <w:t>` — массив объектов с детальными записями (файл, страница, контекст, маркер)</w:t>
+        <w:t>- `results` — массив объектов с детальными записями (файл, страница, контекст, маркер)</w:t>
       </w:r>
     </w:p>
     <w:p>
       <w:pPr>
         <w:pStyle w:val="1"/>
       </w:pPr>
-      <w:bookmarkStart w:id="7" w:name="_Toc230224536"/>
+      <w:bookmarkStart w:id="8" w:name="_Toc230224536"/>
       <w:r>
         <w:t>3. Тестирование и результаты</w:t>
       </w:r>
-      <w:bookmarkEnd w:id="7"/>
+      <w:bookmarkEnd w:id="8"/>
     </w:p>
     <w:p>
       <w:pPr>
@@ -2834,14 +2785,14 @@
           <w:shd w:val="clear" w:color="auto" w:fill="151517"/>
         </w:rPr>
       </w:pPr>
-      <w:bookmarkStart w:id="8" w:name="_Toc230224537"/>
+      <w:bookmarkStart w:id="9" w:name="_Toc230224537"/>
       <w:r>
         <w:t>3.1</w:t>
       </w:r>
       <w:r>
         <w:t xml:space="preserve"> </w:t>
       </w:r>
-      <w:bookmarkEnd w:id="8"/>
+      <w:bookmarkEnd w:id="9"/>
       <w:r>
         <w:t>Качество извлечения текста из PDF</w:t>
       </w:r>
@@ -2881,7 +2832,6 @@
         </w:rPr>
         <w:t xml:space="preserve"> </w:t>
       </w:r>
-      <w:proofErr w:type="spellStart"/>
       <w:r>
         <w:rPr>
           <w:rFonts w:ascii="Times New Roman" w:hAnsi="Times New Roman" w:cs="Times New Roman"/>
@@ -2890,7 +2840,6 @@
         </w:rPr>
         <w:t>elibrary</w:t>
       </w:r>
-      <w:proofErr w:type="spellEnd"/>
       <w:r>
         <w:rPr>
           <w:rFonts w:ascii="Times New Roman" w:hAnsi="Times New Roman" w:cs="Times New Roman"/>
@@ -2898,7 +2847,6 @@
         </w:rPr>
         <w:t>.</w:t>
       </w:r>
-      <w:proofErr w:type="spellStart"/>
       <w:r>
         <w:rPr>
           <w:rFonts w:ascii="Times New Roman" w:hAnsi="Times New Roman" w:cs="Times New Roman"/>
@@ -2907,7 +2855,6 @@
         </w:rPr>
         <w:t>ru</w:t>
       </w:r>
-      <w:proofErr w:type="spellEnd"/>
       <w:r>
         <w:rPr>
           <w:rFonts w:ascii="Times New Roman" w:hAnsi="Times New Roman" w:cs="Times New Roman"/>
@@ -2930,7 +2877,7 @@
       <w:pPr>
         <w:pStyle w:val="2"/>
       </w:pPr>
-      <w:bookmarkStart w:id="9" w:name="_Toc230224538"/>
+      <w:bookmarkStart w:id="10" w:name="_Toc230224538"/>
       <w:r>
         <w:t>3.</w:t>
       </w:r>
@@ -2943,7 +2890,7 @@
       <w:r>
         <w:t>маркеров</w:t>
       </w:r>
-      <w:bookmarkEnd w:id="9"/>
+      <w:bookmarkEnd w:id="10"/>
     </w:p>
     <w:p>
       <w:pPr>
@@ -3011,9 +2958,71 @@
           <w:lang w:val="en-US" w:eastAsia="ru-RU"/>
           <w14:ligatures w14:val="none"/>
         </w:rPr>
-        <w:t>"</w:t>
-      </w:r>
-      <w:proofErr w:type="spellStart"/>
+        <w:t>"article_title"</w:t>
+      </w:r>
+      <w:r>
+        <w:rPr>
+          <w:rFonts w:ascii="Consolas" w:eastAsia="Times New Roman" w:hAnsi="Consolas" w:cs="Times New Roman"/>
+          <w:color w:val="BBBEBF"/>
+          <w:kern w:val="0"/>
+          <w:sz w:val="21"/>
+          <w:szCs w:val="21"/>
+          <w:lang w:val="en-US" w:eastAsia="ru-RU"/>
+          <w14:ligatures w14:val="none"/>
+        </w:rPr>
+        <w:t xml:space="preserve">: </w:t>
+      </w:r>
+      <w:r>
+        <w:rPr>
+          <w:rFonts w:ascii="Consolas" w:eastAsia="Times New Roman" w:hAnsi="Consolas" w:cs="Times New Roman"/>
+          <w:color w:val="A5D6FF"/>
+          <w:kern w:val="0"/>
+          <w:sz w:val="21"/>
+          <w:szCs w:val="21"/>
+          <w:lang w:val="en-US" w:eastAsia="ru-RU"/>
+          <w14:ligatures w14:val="none"/>
+        </w:rPr>
+        <w:t>"3"</w:t>
+      </w:r>
+      <w:r>
+        <w:rPr>
+          <w:rFonts w:ascii="Consolas" w:eastAsia="Times New Roman" w:hAnsi="Consolas" w:cs="Times New Roman"/>
+          <w:color w:val="BBBEBF"/>
+          <w:kern w:val="0"/>
+          <w:sz w:val="21"/>
+          <w:szCs w:val="21"/>
+          <w:lang w:val="en-US" w:eastAsia="ru-RU"/>
+          <w14:ligatures w14:val="none"/>
+        </w:rPr>
+        <w:t>,</w:t>
+      </w:r>
+    </w:p>
+    <w:p>
+      <w:pPr>
+        <w:shd w:val="clear" w:color="auto" w:fill="121314"/>
+        <w:spacing w:after="0" w:line="285" w:lineRule="atLeast"/>
+        <w:rPr>
+          <w:rFonts w:ascii="Consolas" w:eastAsia="Times New Roman" w:hAnsi="Consolas" w:cs="Times New Roman"/>
+          <w:color w:val="BBBEBF"/>
+          <w:kern w:val="0"/>
+          <w:sz w:val="21"/>
+          <w:szCs w:val="21"/>
+          <w:lang w:val="en-US" w:eastAsia="ru-RU"/>
+          <w14:ligatures w14:val="none"/>
+        </w:rPr>
+      </w:pPr>
+      <w:r>
+        <w:rPr>
+          <w:rFonts w:ascii="Consolas" w:eastAsia="Times New Roman" w:hAnsi="Consolas" w:cs="Times New Roman"/>
+          <w:color w:val="BBBEBF"/>
+          <w:kern w:val="0"/>
+          <w:sz w:val="21"/>
+          <w:szCs w:val="21"/>
+          <w:lang w:val="en-US" w:eastAsia="ru-RU"/>
+          <w14:ligatures w14:val="none"/>
+        </w:rPr>
+        <w:t xml:space="preserve">            </w:t>
+      </w:r>
       <w:r>
         <w:rPr>
           <w:rFonts w:ascii="Consolas" w:eastAsia="Times New Roman" w:hAnsi="Consolas" w:cs="Times New Roman"/>
@@ -3024,20 +3033,7 @@
           <w:lang w:val="en-US" w:eastAsia="ru-RU"/>
           <w14:ligatures w14:val="none"/>
         </w:rPr>
-        <w:t>article_title</w:t>
-      </w:r>
-      <w:proofErr w:type="spellEnd"/>
-      <w:r>
-        <w:rPr>
-          <w:rFonts w:ascii="Consolas" w:eastAsia="Times New Roman" w:hAnsi="Consolas" w:cs="Times New Roman"/>
-          <w:color w:val="7EE787"/>
-          <w:kern w:val="0"/>
-          <w:sz w:val="21"/>
-          <w:szCs w:val="21"/>
-          <w:lang w:val="en-US" w:eastAsia="ru-RU"/>
-          <w14:ligatures w14:val="none"/>
-        </w:rPr>
-        <w:t>"</w:t>
+        <w:t>"author"</w:t>
       </w:r>
       <w:r>
         <w:rPr>
@@ -3061,7 +3057,79 @@
           <w:lang w:val="en-US" w:eastAsia="ru-RU"/>
           <w14:ligatures w14:val="none"/>
         </w:rPr>
-        <w:t>"3"</w:t>
+        <w:t>"</w:t>
+      </w:r>
+      <w:r>
+        <w:rPr>
+          <w:rFonts w:ascii="Consolas" w:eastAsia="Times New Roman" w:hAnsi="Consolas" w:cs="Times New Roman"/>
+          <w:color w:val="A5D6FF"/>
+          <w:kern w:val="0"/>
+          <w:sz w:val="21"/>
+          <w:szCs w:val="21"/>
+          <w:lang w:eastAsia="ru-RU"/>
+          <w14:ligatures w14:val="none"/>
+        </w:rPr>
+        <w:t>В</w:t>
+      </w:r>
+      <w:r>
+        <w:rPr>
+          <w:rFonts w:ascii="Consolas" w:eastAsia="Times New Roman" w:hAnsi="Consolas" w:cs="Times New Roman"/>
+          <w:color w:val="A5D6FF"/>
+          <w:kern w:val="0"/>
+          <w:sz w:val="21"/>
+          <w:szCs w:val="21"/>
+          <w:lang w:val="en-US" w:eastAsia="ru-RU"/>
+          <w14:ligatures w14:val="none"/>
+        </w:rPr>
+        <w:t>.</w:t>
+      </w:r>
+      <w:r>
+        <w:rPr>
+          <w:rFonts w:ascii="Consolas" w:eastAsia="Times New Roman" w:hAnsi="Consolas" w:cs="Times New Roman"/>
+          <w:color w:val="A5D6FF"/>
+          <w:kern w:val="0"/>
+          <w:sz w:val="21"/>
+          <w:szCs w:val="21"/>
+          <w:lang w:eastAsia="ru-RU"/>
+          <w14:ligatures w14:val="none"/>
+        </w:rPr>
+        <w:t>И</w:t>
+      </w:r>
+      <w:r>
+        <w:rPr>
+          <w:rFonts w:ascii="Consolas" w:eastAsia="Times New Roman" w:hAnsi="Consolas" w:cs="Times New Roman"/>
+          <w:color w:val="A5D6FF"/>
+          <w:kern w:val="0"/>
+          <w:sz w:val="21"/>
+          <w:szCs w:val="21"/>
+          <w:lang w:val="en-US" w:eastAsia="ru-RU"/>
+          <w14:ligatures w14:val="none"/>
+        </w:rPr>
+        <w:t xml:space="preserve">. </w:t>
+      </w:r>
+      <w:r>
+        <w:rPr>
+          <w:rFonts w:ascii="Consolas" w:eastAsia="Times New Roman" w:hAnsi="Consolas" w:cs="Times New Roman"/>
+          <w:color w:val="A5D6FF"/>
+          <w:kern w:val="0"/>
+          <w:sz w:val="21"/>
+          <w:szCs w:val="21"/>
+          <w:lang w:eastAsia="ru-RU"/>
+          <w14:ligatures w14:val="none"/>
+        </w:rPr>
+        <w:t>Сенашов</w:t>
+      </w:r>
+      <w:r>
+        <w:rPr>
+          <w:rFonts w:ascii="Consolas" w:eastAsia="Times New Roman" w:hAnsi="Consolas" w:cs="Times New Roman"/>
+          <w:color w:val="A5D6FF"/>
+          <w:kern w:val="0"/>
+          <w:sz w:val="21"/>
+          <w:szCs w:val="21"/>
+          <w:lang w:val="en-US" w:eastAsia="ru-RU"/>
+          <w14:ligatures w14:val="none"/>
+        </w:rPr>
+        <w:t>"</w:t>
       </w:r>
       <w:r>
         <w:rPr>
@@ -3086,7 +3154,7 @@
           <w:kern w:val="0"/>
           <w:sz w:val="21"/>
           <w:szCs w:val="21"/>
-          <w:lang w:val="en-US" w:eastAsia="ru-RU"/>
+          <w:lang w:eastAsia="ru-RU"/>
           <w14:ligatures w14:val="none"/>
         </w:rPr>
       </w:pPr>
@@ -3109,10 +3177,10 @@
           <w:kern w:val="0"/>
           <w:sz w:val="21"/>
           <w:szCs w:val="21"/>
-          <w:lang w:val="en-US" w:eastAsia="ru-RU"/>
+          <w:lang w:eastAsia="ru-RU"/>
           <w14:ligatures w14:val="none"/>
         </w:rPr>
-        <w:t>"author"</w:t>
+        <w:t>"page"</w:t>
       </w:r>
       <w:r>
         <w:rPr>
@@ -3121,7 +3189,7 @@
           <w:kern w:val="0"/>
           <w:sz w:val="21"/>
           <w:szCs w:val="21"/>
-          <w:lang w:val="en-US" w:eastAsia="ru-RU"/>
+          <w:lang w:eastAsia="ru-RU"/>
           <w14:ligatures w14:val="none"/>
         </w:rPr>
         <w:t xml:space="preserve">: </w:t>
@@ -3129,14 +3197,77 @@
       <w:r>
         <w:rPr>
           <w:rFonts w:ascii="Consolas" w:eastAsia="Times New Roman" w:hAnsi="Consolas" w:cs="Times New Roman"/>
-          <w:color w:val="A5D6FF"/>
+          <w:color w:val="B5CEA8"/>
           <w:kern w:val="0"/>
           <w:sz w:val="21"/>
           <w:szCs w:val="21"/>
-          <w:lang w:val="en-US" w:eastAsia="ru-RU"/>
+          <w:lang w:eastAsia="ru-RU"/>
           <w14:ligatures w14:val="none"/>
         </w:rPr>
-        <w:t>"</w:t>
+        <w:t>4</w:t>
+      </w:r>
+      <w:r>
+        <w:rPr>
+          <w:rFonts w:ascii="Consolas" w:eastAsia="Times New Roman" w:hAnsi="Consolas" w:cs="Times New Roman"/>
+          <w:color w:val="BBBEBF"/>
+          <w:kern w:val="0"/>
+          <w:sz w:val="21"/>
+          <w:szCs w:val="21"/>
+          <w:lang w:eastAsia="ru-RU"/>
+          <w14:ligatures w14:val="none"/>
+        </w:rPr>
+        <w:t>,</w:t>
+      </w:r>
+    </w:p>
+    <w:p>
+      <w:pPr>
+        <w:shd w:val="clear" w:color="auto" w:fill="121314"/>
+        <w:spacing w:after="0" w:line="285" w:lineRule="atLeast"/>
+        <w:rPr>
+          <w:rFonts w:ascii="Consolas" w:eastAsia="Times New Roman" w:hAnsi="Consolas" w:cs="Times New Roman"/>
+          <w:color w:val="BBBEBF"/>
+          <w:kern w:val="0"/>
+          <w:sz w:val="21"/>
+          <w:szCs w:val="21"/>
+          <w:lang w:eastAsia="ru-RU"/>
+          <w14:ligatures w14:val="none"/>
+        </w:rPr>
+      </w:pPr>
+      <w:r>
+        <w:rPr>
+          <w:rFonts w:ascii="Consolas" w:eastAsia="Times New Roman" w:hAnsi="Consolas" w:cs="Times New Roman"/>
+          <w:color w:val="BBBEBF"/>
+          <w:kern w:val="0"/>
+          <w:sz w:val="21"/>
+          <w:szCs w:val="21"/>
+          <w:lang w:eastAsia="ru-RU"/>
+          <w14:ligatures w14:val="none"/>
+        </w:rPr>
+        <w:t xml:space="preserve">            </w:t>
+      </w:r>
+      <w:r>
+        <w:rPr>
+          <w:rFonts w:ascii="Consolas" w:eastAsia="Times New Roman" w:hAnsi="Consolas" w:cs="Times New Roman"/>
+          <w:color w:val="7EE787"/>
+          <w:kern w:val="0"/>
+          <w:sz w:val="21"/>
+          <w:szCs w:val="21"/>
+          <w:lang w:eastAsia="ru-RU"/>
+          <w14:ligatures w14:val="none"/>
+        </w:rPr>
+        <w:t>"context"</w:t>
+      </w:r>
+      <w:r>
+        <w:rPr>
+          <w:rFonts w:ascii="Consolas" w:eastAsia="Times New Roman" w:hAnsi="Consolas" w:cs="Times New Roman"/>
+          <w:color w:val="BBBEBF"/>
+          <w:kern w:val="0"/>
+          <w:sz w:val="21"/>
+          <w:szCs w:val="21"/>
+          <w:lang w:eastAsia="ru-RU"/>
+          <w14:ligatures w14:val="none"/>
+        </w:rPr>
+        <w:t xml:space="preserve">: </w:t>
       </w:r>
       <w:r>
         <w:rPr>
@@ -3148,19 +3279,70 @@
           <w:lang w:eastAsia="ru-RU"/>
           <w14:ligatures w14:val="none"/>
         </w:rPr>
-        <w:t>В</w:t>
+        <w:t>"Очевидно, что группа является слабо сопряженной бипримитивно конечной тогда и только тогда, когда все элементы простых порядков в ней конечны."</w:t>
       </w:r>
       <w:r>
         <w:rPr>
           <w:rFonts w:ascii="Consolas" w:eastAsia="Times New Roman" w:hAnsi="Consolas" w:cs="Times New Roman"/>
-          <w:color w:val="A5D6FF"/>
+          <w:color w:val="BBBEBF"/>
           <w:kern w:val="0"/>
           <w:sz w:val="21"/>
           <w:szCs w:val="21"/>
-          <w:lang w:val="en-US" w:eastAsia="ru-RU"/>
+          <w:lang w:eastAsia="ru-RU"/>
           <w14:ligatures w14:val="none"/>
         </w:rPr>
-        <w:t>.</w:t>
+        <w:t>,</w:t>
+      </w:r>
+    </w:p>
+    <w:p>
+      <w:pPr>
+        <w:shd w:val="clear" w:color="auto" w:fill="121314"/>
+        <w:spacing w:after="0" w:line="285" w:lineRule="atLeast"/>
+        <w:rPr>
+          <w:rFonts w:ascii="Consolas" w:eastAsia="Times New Roman" w:hAnsi="Consolas" w:cs="Times New Roman"/>
+          <w:color w:val="BBBEBF"/>
+          <w:kern w:val="0"/>
+          <w:sz w:val="21"/>
+          <w:szCs w:val="21"/>
+          <w:lang w:eastAsia="ru-RU"/>
+          <w14:ligatures w14:val="none"/>
+        </w:rPr>
+      </w:pPr>
+      <w:r>
+        <w:rPr>
+          <w:rFonts w:ascii="Consolas" w:eastAsia="Times New Roman" w:hAnsi="Consolas" w:cs="Times New Roman"/>
+          <w:color w:val="BBBEBF"/>
+          <w:kern w:val="0"/>
+          <w:sz w:val="21"/>
+          <w:szCs w:val="21"/>
+          <w:lang w:eastAsia="ru-RU"/>
+          <w14:ligatures w14:val="none"/>
+        </w:rPr>
+        <w:t xml:space="preserve">            </w:t>
+      </w:r>
+      <w:r>
+        <w:rPr>
+          <w:rFonts w:ascii="Consolas" w:eastAsia="Times New Roman" w:hAnsi="Consolas" w:cs="Times New Roman"/>
+          <w:color w:val="7EE787"/>
+          <w:kern w:val="0"/>
+          <w:sz w:val="21"/>
+          <w:szCs w:val="21"/>
+          <w:lang w:eastAsia="ru-RU"/>
+          <w14:ligatures w14:val="none"/>
+        </w:rPr>
+        <w:t>"formula_latex"</w:t>
+      </w:r>
+      <w:r>
+        <w:rPr>
+          <w:rFonts w:ascii="Consolas" w:eastAsia="Times New Roman" w:hAnsi="Consolas" w:cs="Times New Roman"/>
+          <w:color w:val="BBBEBF"/>
+          <w:kern w:val="0"/>
+          <w:sz w:val="21"/>
+          <w:szCs w:val="21"/>
+          <w:lang w:eastAsia="ru-RU"/>
+          <w14:ligatures w14:val="none"/>
+        </w:rPr>
+        <w:t xml:space="preserve">: </w:t>
       </w:r>
       <w:r>
         <w:rPr>
@@ -3172,63 +3354,9 @@
           <w:lang w:eastAsia="ru-RU"/>
           <w14:ligatures w14:val="none"/>
         </w:rPr>
-        <w:t>И</w:t>
-      </w:r>
-      <w:r>
-        <w:rPr>
-          <w:rFonts w:ascii="Consolas" w:eastAsia="Times New Roman" w:hAnsi="Consolas" w:cs="Times New Roman"/>
-          <w:color w:val="A5D6FF"/>
-          <w:kern w:val="0"/>
-          <w:sz w:val="21"/>
-          <w:szCs w:val="21"/>
-          <w:lang w:val="en-US" w:eastAsia="ru-RU"/>
-          <w14:ligatures w14:val="none"/>
-        </w:rPr>
-        <w:t xml:space="preserve">. </w:t>
-      </w:r>
-      <w:proofErr w:type="spellStart"/>
-      <w:r>
-        <w:rPr>
-          <w:rFonts w:ascii="Consolas" w:eastAsia="Times New Roman" w:hAnsi="Consolas" w:cs="Times New Roman"/>
-          <w:color w:val="A5D6FF"/>
-          <w:kern w:val="0"/>
-          <w:sz w:val="21"/>
-          <w:szCs w:val="21"/>
-          <w:lang w:eastAsia="ru-RU"/>
-          <w14:ligatures w14:val="none"/>
-        </w:rPr>
-        <w:t>Сенашов</w:t>
-      </w:r>
-      <w:proofErr w:type="spellEnd"/>
-      <w:r>
-        <w:rPr>
-          <w:rFonts w:ascii="Consolas" w:eastAsia="Times New Roman" w:hAnsi="Consolas" w:cs="Times New Roman"/>
-          <w:color w:val="A5D6FF"/>
-          <w:kern w:val="0"/>
-          <w:sz w:val="21"/>
-          <w:szCs w:val="21"/>
-          <w:lang w:val="en-US" w:eastAsia="ru-RU"/>
-          <w14:ligatures w14:val="none"/>
-        </w:rPr>
-        <w:t>"</w:t>
-      </w:r>
-      <w:r>
-        <w:rPr>
-          <w:rFonts w:ascii="Consolas" w:eastAsia="Times New Roman" w:hAnsi="Consolas" w:cs="Times New Roman"/>
-          <w:color w:val="BBBEBF"/>
-          <w:kern w:val="0"/>
-          <w:sz w:val="21"/>
-          <w:szCs w:val="21"/>
-          <w:lang w:val="en-US" w:eastAsia="ru-RU"/>
-          <w14:ligatures w14:val="none"/>
-        </w:rPr>
-        <w:t>,</w:t>
-      </w:r>
-    </w:p>
-    <w:p>
-      <w:pPr>
-        <w:shd w:val="clear" w:color="auto" w:fill="121314"/>
-        <w:spacing w:after="0" w:line="285" w:lineRule="atLeast"/>
+        <w:t>""</w:t>
+      </w:r>
+      <w:r>
         <w:rPr>
           <w:rFonts w:ascii="Consolas" w:eastAsia="Times New Roman" w:hAnsi="Consolas" w:cs="Times New Roman"/>
           <w:color w:val="BBBEBF"/>
@@ -3238,15 +3366,31 @@
           <w:lang w:eastAsia="ru-RU"/>
           <w14:ligatures w14:val="none"/>
         </w:rPr>
-      </w:pPr>
-      <w:r>
+        <w:t>,</w:t>
+      </w:r>
+    </w:p>
+    <w:p>
+      <w:pPr>
+        <w:shd w:val="clear" w:color="auto" w:fill="121314"/>
+        <w:spacing w:after="0" w:line="285" w:lineRule="atLeast"/>
         <w:rPr>
           <w:rFonts w:ascii="Consolas" w:eastAsia="Times New Roman" w:hAnsi="Consolas" w:cs="Times New Roman"/>
           <w:color w:val="BBBEBF"/>
           <w:kern w:val="0"/>
           <w:sz w:val="21"/>
           <w:szCs w:val="21"/>
-          <w:lang w:val="en-US" w:eastAsia="ru-RU"/>
+          <w:lang w:eastAsia="ru-RU"/>
+          <w14:ligatures w14:val="none"/>
+        </w:rPr>
+      </w:pPr>
+      <w:r>
+        <w:rPr>
+          <w:rFonts w:ascii="Consolas" w:eastAsia="Times New Roman" w:hAnsi="Consolas" w:cs="Times New Roman"/>
+          <w:color w:val="BBBEBF"/>
+          <w:kern w:val="0"/>
+          <w:sz w:val="21"/>
+          <w:szCs w:val="21"/>
+          <w:lang w:eastAsia="ru-RU"/>
           <w14:ligatures w14:val="none"/>
         </w:rPr>
         <w:t xml:space="preserve">            </w:t>
@@ -3261,362 +3405,7 @@
           <w:lang w:eastAsia="ru-RU"/>
           <w14:ligatures w14:val="none"/>
         </w:rPr>
-        <w:t>"</w:t>
-      </w:r>
-      <w:proofErr w:type="spellStart"/>
-      <w:r>
-        <w:rPr>
-          <w:rFonts w:ascii="Consolas" w:eastAsia="Times New Roman" w:hAnsi="Consolas" w:cs="Times New Roman"/>
-          <w:color w:val="7EE787"/>
-          <w:kern w:val="0"/>
-          <w:sz w:val="21"/>
-          <w:szCs w:val="21"/>
-          <w:lang w:eastAsia="ru-RU"/>
-          <w14:ligatures w14:val="none"/>
-        </w:rPr>
-        <w:t>page</w:t>
-      </w:r>
-      <w:proofErr w:type="spellEnd"/>
-      <w:r>
-        <w:rPr>
-          <w:rFonts w:ascii="Consolas" w:eastAsia="Times New Roman" w:hAnsi="Consolas" w:cs="Times New Roman"/>
-          <w:color w:val="7EE787"/>
-          <w:kern w:val="0"/>
-          <w:sz w:val="21"/>
-          <w:szCs w:val="21"/>
-          <w:lang w:eastAsia="ru-RU"/>
-          <w14:ligatures w14:val="none"/>
-        </w:rPr>
-        <w:t>"</w:t>
-      </w:r>
-      <w:r>
-        <w:rPr>
-          <w:rFonts w:ascii="Consolas" w:eastAsia="Times New Roman" w:hAnsi="Consolas" w:cs="Times New Roman"/>
-          <w:color w:val="BBBEBF"/>
-          <w:kern w:val="0"/>
-          <w:sz w:val="21"/>
-          <w:szCs w:val="21"/>
-          <w:lang w:eastAsia="ru-RU"/>
-          <w14:ligatures w14:val="none"/>
-        </w:rPr>
-        <w:t xml:space="preserve">: </w:t>
-      </w:r>
-      <w:r>
-        <w:rPr>
-          <w:rFonts w:ascii="Consolas" w:eastAsia="Times New Roman" w:hAnsi="Consolas" w:cs="Times New Roman"/>
-          <w:color w:val="B5CEA8"/>
-          <w:kern w:val="0"/>
-          <w:sz w:val="21"/>
-          <w:szCs w:val="21"/>
-          <w:lang w:eastAsia="ru-RU"/>
-          <w14:ligatures w14:val="none"/>
-        </w:rPr>
-        <w:t>4</w:t>
-      </w:r>
-      <w:r>
-        <w:rPr>
-          <w:rFonts w:ascii="Consolas" w:eastAsia="Times New Roman" w:hAnsi="Consolas" w:cs="Times New Roman"/>
-          <w:color w:val="BBBEBF"/>
-          <w:kern w:val="0"/>
-          <w:sz w:val="21"/>
-          <w:szCs w:val="21"/>
-          <w:lang w:eastAsia="ru-RU"/>
-          <w14:ligatures w14:val="none"/>
-        </w:rPr>
-        <w:t>,</w:t>
-      </w:r>
-    </w:p>
-    <w:p>
-      <w:pPr>
-        <w:shd w:val="clear" w:color="auto" w:fill="121314"/>
-        <w:spacing w:after="0" w:line="285" w:lineRule="atLeast"/>
-        <w:rPr>
-          <w:rFonts w:ascii="Consolas" w:eastAsia="Times New Roman" w:hAnsi="Consolas" w:cs="Times New Roman"/>
-          <w:color w:val="BBBEBF"/>
-          <w:kern w:val="0"/>
-          <w:sz w:val="21"/>
-          <w:szCs w:val="21"/>
-          <w:lang w:eastAsia="ru-RU"/>
-          <w14:ligatures w14:val="none"/>
-        </w:rPr>
-      </w:pPr>
-      <w:r>
-        <w:rPr>
-          <w:rFonts w:ascii="Consolas" w:eastAsia="Times New Roman" w:hAnsi="Consolas" w:cs="Times New Roman"/>
-          <w:color w:val="BBBEBF"/>
-          <w:kern w:val="0"/>
-          <w:sz w:val="21"/>
-          <w:szCs w:val="21"/>
-          <w:lang w:eastAsia="ru-RU"/>
-          <w14:ligatures w14:val="none"/>
-        </w:rPr>
-        <w:t xml:space="preserve">            </w:t>
-      </w:r>
-      <w:r>
-        <w:rPr>
-          <w:rFonts w:ascii="Consolas" w:eastAsia="Times New Roman" w:hAnsi="Consolas" w:cs="Times New Roman"/>
-          <w:color w:val="7EE787"/>
-          <w:kern w:val="0"/>
-          <w:sz w:val="21"/>
-          <w:szCs w:val="21"/>
-          <w:lang w:eastAsia="ru-RU"/>
-          <w14:ligatures w14:val="none"/>
-        </w:rPr>
-        <w:t>"</w:t>
-      </w:r>
-      <w:proofErr w:type="spellStart"/>
-      <w:r>
-        <w:rPr>
-          <w:rFonts w:ascii="Consolas" w:eastAsia="Times New Roman" w:hAnsi="Consolas" w:cs="Times New Roman"/>
-          <w:color w:val="7EE787"/>
-          <w:kern w:val="0"/>
-          <w:sz w:val="21"/>
-          <w:szCs w:val="21"/>
-          <w:lang w:eastAsia="ru-RU"/>
-          <w14:ligatures w14:val="none"/>
-        </w:rPr>
-        <w:t>context</w:t>
-      </w:r>
-      <w:proofErr w:type="spellEnd"/>
-      <w:r>
-        <w:rPr>
-          <w:rFonts w:ascii="Consolas" w:eastAsia="Times New Roman" w:hAnsi="Consolas" w:cs="Times New Roman"/>
-          <w:color w:val="7EE787"/>
-          <w:kern w:val="0"/>
-          <w:sz w:val="21"/>
-          <w:szCs w:val="21"/>
-          <w:lang w:eastAsia="ru-RU"/>
-          <w14:ligatures w14:val="none"/>
-        </w:rPr>
-        <w:t>"</w:t>
-      </w:r>
-      <w:r>
-        <w:rPr>
-          <w:rFonts w:ascii="Consolas" w:eastAsia="Times New Roman" w:hAnsi="Consolas" w:cs="Times New Roman"/>
-          <w:color w:val="BBBEBF"/>
-          <w:kern w:val="0"/>
-          <w:sz w:val="21"/>
-          <w:szCs w:val="21"/>
-          <w:lang w:eastAsia="ru-RU"/>
-          <w14:ligatures w14:val="none"/>
-        </w:rPr>
-        <w:t xml:space="preserve">: </w:t>
-      </w:r>
-      <w:r>
-        <w:rPr>
-          <w:rFonts w:ascii="Consolas" w:eastAsia="Times New Roman" w:hAnsi="Consolas" w:cs="Times New Roman"/>
-          <w:color w:val="A5D6FF"/>
-          <w:kern w:val="0"/>
-          <w:sz w:val="21"/>
-          <w:szCs w:val="21"/>
-          <w:lang w:eastAsia="ru-RU"/>
-          <w14:ligatures w14:val="none"/>
-        </w:rPr>
-        <w:t xml:space="preserve">"Очевидно, что группа является слабо сопряженной </w:t>
-      </w:r>
-      <w:proofErr w:type="spellStart"/>
-      <w:r>
-        <w:rPr>
-          <w:rFonts w:ascii="Consolas" w:eastAsia="Times New Roman" w:hAnsi="Consolas" w:cs="Times New Roman"/>
-          <w:color w:val="A5D6FF"/>
-          <w:kern w:val="0"/>
-          <w:sz w:val="21"/>
-          <w:szCs w:val="21"/>
-          <w:lang w:eastAsia="ru-RU"/>
-          <w14:ligatures w14:val="none"/>
-        </w:rPr>
-        <w:t>бипримитивно</w:t>
-      </w:r>
-      <w:proofErr w:type="spellEnd"/>
-      <w:r>
-        <w:rPr>
-          <w:rFonts w:ascii="Consolas" w:eastAsia="Times New Roman" w:hAnsi="Consolas" w:cs="Times New Roman"/>
-          <w:color w:val="A5D6FF"/>
-          <w:kern w:val="0"/>
-          <w:sz w:val="21"/>
-          <w:szCs w:val="21"/>
-          <w:lang w:eastAsia="ru-RU"/>
-          <w14:ligatures w14:val="none"/>
-        </w:rPr>
-        <w:t xml:space="preserve"> конечной тогда и только тогда, когда все элементы простых порядков в ней конечны."</w:t>
-      </w:r>
-      <w:r>
-        <w:rPr>
-          <w:rFonts w:ascii="Consolas" w:eastAsia="Times New Roman" w:hAnsi="Consolas" w:cs="Times New Roman"/>
-          <w:color w:val="BBBEBF"/>
-          <w:kern w:val="0"/>
-          <w:sz w:val="21"/>
-          <w:szCs w:val="21"/>
-          <w:lang w:eastAsia="ru-RU"/>
-          <w14:ligatures w14:val="none"/>
-        </w:rPr>
-        <w:t>,</w:t>
-      </w:r>
-    </w:p>
-    <w:p>
-      <w:pPr>
-        <w:shd w:val="clear" w:color="auto" w:fill="121314"/>
-        <w:spacing w:after="0" w:line="285" w:lineRule="atLeast"/>
-        <w:rPr>
-          <w:rFonts w:ascii="Consolas" w:eastAsia="Times New Roman" w:hAnsi="Consolas" w:cs="Times New Roman"/>
-          <w:color w:val="BBBEBF"/>
-          <w:kern w:val="0"/>
-          <w:sz w:val="21"/>
-          <w:szCs w:val="21"/>
-          <w:lang w:eastAsia="ru-RU"/>
-          <w14:ligatures w14:val="none"/>
-        </w:rPr>
-      </w:pPr>
-      <w:r>
-        <w:rPr>
-          <w:rFonts w:ascii="Consolas" w:eastAsia="Times New Roman" w:hAnsi="Consolas" w:cs="Times New Roman"/>
-          <w:color w:val="BBBEBF"/>
-          <w:kern w:val="0"/>
-          <w:sz w:val="21"/>
-          <w:szCs w:val="21"/>
-          <w:lang w:eastAsia="ru-RU"/>
-          <w14:ligatures w14:val="none"/>
-        </w:rPr>
-        <w:t xml:space="preserve">            </w:t>
-      </w:r>
-      <w:r>
-        <w:rPr>
-          <w:rFonts w:ascii="Consolas" w:eastAsia="Times New Roman" w:hAnsi="Consolas" w:cs="Times New Roman"/>
-          <w:color w:val="7EE787"/>
-          <w:kern w:val="0"/>
-          <w:sz w:val="21"/>
-          <w:szCs w:val="21"/>
-          <w:lang w:eastAsia="ru-RU"/>
-          <w14:ligatures w14:val="none"/>
-        </w:rPr>
-        <w:t>"</w:t>
-      </w:r>
-      <w:proofErr w:type="spellStart"/>
-      <w:r>
-        <w:rPr>
-          <w:rFonts w:ascii="Consolas" w:eastAsia="Times New Roman" w:hAnsi="Consolas" w:cs="Times New Roman"/>
-          <w:color w:val="7EE787"/>
-          <w:kern w:val="0"/>
-          <w:sz w:val="21"/>
-          <w:szCs w:val="21"/>
-          <w:lang w:eastAsia="ru-RU"/>
-          <w14:ligatures w14:val="none"/>
-        </w:rPr>
-        <w:t>formula_latex</w:t>
-      </w:r>
-      <w:proofErr w:type="spellEnd"/>
-      <w:r>
-        <w:rPr>
-          <w:rFonts w:ascii="Consolas" w:eastAsia="Times New Roman" w:hAnsi="Consolas" w:cs="Times New Roman"/>
-          <w:color w:val="7EE787"/>
-          <w:kern w:val="0"/>
-          <w:sz w:val="21"/>
-          <w:szCs w:val="21"/>
-          <w:lang w:eastAsia="ru-RU"/>
-          <w14:ligatures w14:val="none"/>
-        </w:rPr>
-        <w:t>"</w:t>
-      </w:r>
-      <w:r>
-        <w:rPr>
-          <w:rFonts w:ascii="Consolas" w:eastAsia="Times New Roman" w:hAnsi="Consolas" w:cs="Times New Roman"/>
-          <w:color w:val="BBBEBF"/>
-          <w:kern w:val="0"/>
-          <w:sz w:val="21"/>
-          <w:szCs w:val="21"/>
-          <w:lang w:eastAsia="ru-RU"/>
-          <w14:ligatures w14:val="none"/>
-        </w:rPr>
-        <w:t xml:space="preserve">: </w:t>
-      </w:r>
-      <w:r>
-        <w:rPr>
-          <w:rFonts w:ascii="Consolas" w:eastAsia="Times New Roman" w:hAnsi="Consolas" w:cs="Times New Roman"/>
-          <w:color w:val="A5D6FF"/>
-          <w:kern w:val="0"/>
-          <w:sz w:val="21"/>
-          <w:szCs w:val="21"/>
-          <w:lang w:eastAsia="ru-RU"/>
-          <w14:ligatures w14:val="none"/>
-        </w:rPr>
-        <w:t>""</w:t>
-      </w:r>
-      <w:r>
-        <w:rPr>
-          <w:rFonts w:ascii="Consolas" w:eastAsia="Times New Roman" w:hAnsi="Consolas" w:cs="Times New Roman"/>
-          <w:color w:val="BBBEBF"/>
-          <w:kern w:val="0"/>
-          <w:sz w:val="21"/>
-          <w:szCs w:val="21"/>
-          <w:lang w:eastAsia="ru-RU"/>
-          <w14:ligatures w14:val="none"/>
-        </w:rPr>
-        <w:t>,</w:t>
-      </w:r>
-    </w:p>
-    <w:p>
-      <w:pPr>
-        <w:shd w:val="clear" w:color="auto" w:fill="121314"/>
-        <w:spacing w:after="0" w:line="285" w:lineRule="atLeast"/>
-        <w:rPr>
-          <w:rFonts w:ascii="Consolas" w:eastAsia="Times New Roman" w:hAnsi="Consolas" w:cs="Times New Roman"/>
-          <w:color w:val="BBBEBF"/>
-          <w:kern w:val="0"/>
-          <w:sz w:val="21"/>
-          <w:szCs w:val="21"/>
-          <w:lang w:eastAsia="ru-RU"/>
-          <w14:ligatures w14:val="none"/>
-        </w:rPr>
-      </w:pPr>
-      <w:r>
-        <w:rPr>
-          <w:rFonts w:ascii="Consolas" w:eastAsia="Times New Roman" w:hAnsi="Consolas" w:cs="Times New Roman"/>
-          <w:color w:val="BBBEBF"/>
-          <w:kern w:val="0"/>
-          <w:sz w:val="21"/>
-          <w:szCs w:val="21"/>
-          <w:lang w:eastAsia="ru-RU"/>
-          <w14:ligatures w14:val="none"/>
-        </w:rPr>
-        <w:t xml:space="preserve">            </w:t>
-      </w:r>
-      <w:r>
-        <w:rPr>
-          <w:rFonts w:ascii="Consolas" w:eastAsia="Times New Roman" w:hAnsi="Consolas" w:cs="Times New Roman"/>
-          <w:color w:val="7EE787"/>
-          <w:kern w:val="0"/>
-          <w:sz w:val="21"/>
-          <w:szCs w:val="21"/>
-          <w:lang w:eastAsia="ru-RU"/>
-          <w14:ligatures w14:val="none"/>
-        </w:rPr>
-        <w:t>"</w:t>
-      </w:r>
-      <w:proofErr w:type="spellStart"/>
-      <w:r>
-        <w:rPr>
-          <w:rFonts w:ascii="Consolas" w:eastAsia="Times New Roman" w:hAnsi="Consolas" w:cs="Times New Roman"/>
-          <w:color w:val="7EE787"/>
-          <w:kern w:val="0"/>
-          <w:sz w:val="21"/>
-          <w:szCs w:val="21"/>
-          <w:lang w:eastAsia="ru-RU"/>
-          <w14:ligatures w14:val="none"/>
-        </w:rPr>
-        <w:t>marker</w:t>
-      </w:r>
-      <w:proofErr w:type="spellEnd"/>
-      <w:r>
-        <w:rPr>
-          <w:rFonts w:ascii="Consolas" w:eastAsia="Times New Roman" w:hAnsi="Consolas" w:cs="Times New Roman"/>
-          <w:color w:val="7EE787"/>
-          <w:kern w:val="0"/>
-          <w:sz w:val="21"/>
-          <w:szCs w:val="21"/>
-          <w:lang w:eastAsia="ru-RU"/>
-          <w14:ligatures w14:val="none"/>
-        </w:rPr>
-        <w:t>"</w:t>
+        <w:t>"marker"</w:t>
       </w:r>
       <w:r>
         <w:rPr>
@@ -3877,7 +3666,7 @@
       <w:pPr>
         <w:pStyle w:val="2"/>
       </w:pPr>
-      <w:bookmarkStart w:id="10" w:name="_Toc230224539"/>
+      <w:bookmarkStart w:id="11" w:name="_Toc230224539"/>
       <w:r>
         <w:t>3.</w:t>
       </w:r>
@@ -3887,7 +3676,7 @@
       <w:r>
         <w:t xml:space="preserve"> Производительность</w:t>
       </w:r>
-      <w:bookmarkEnd w:id="10"/>
+      <w:bookmarkEnd w:id="11"/>
     </w:p>
     <w:p>
       <w:pPr>
@@ -3919,73 +3708,102 @@
           <w:sz w:val="28"/>
           <w:szCs w:val="28"/>
         </w:rPr>
-        <w:t xml:space="preserve"> минут на ноутбуке с </w:t>
-      </w:r>
-      <w:proofErr w:type="spellStart"/>
-      <w:r>
-        <w:rPr>
-          <w:rFonts w:ascii="Times New Roman" w:hAnsi="Times New Roman" w:cs="Times New Roman"/>
-          <w:sz w:val="28"/>
-          <w:szCs w:val="28"/>
-        </w:rPr>
-        <w:t>Intel</w:t>
-      </w:r>
-      <w:proofErr w:type="spellEnd"/>
-      <w:r>
-        <w:rPr>
-          <w:rFonts w:ascii="Times New Roman" w:hAnsi="Times New Roman" w:cs="Times New Roman"/>
+        <w:t xml:space="preserve"> минут на ноутбуке с Intel Core i5. Основное время ушло на распознавание формул через Pix2Text. При отключении распознавания формул время сокращается до ~20 секунд.</w:t>
+      </w:r>
+    </w:p>
+    <w:p>
+      <w:pPr>
+        <w:pStyle w:val="1"/>
+      </w:pPr>
+      <w:bookmarkStart w:id="12" w:name="_Toc230224540"/>
+      <w:r>
+        <w:t>4. Ограничения и нереализованные возможности</w:t>
+      </w:r>
+      <w:bookmarkEnd w:id="12"/>
+    </w:p>
+    <w:p>
+      <w:pPr>
+        <w:rPr>
+          <w:rFonts w:ascii="Times New Roman" w:hAnsi="Times New Roman" w:cs="Times New Roman"/>
+          <w:bCs/>
+          <w:sz w:val="28"/>
+          <w:szCs w:val="28"/>
+        </w:rPr>
+      </w:pPr>
+      <w:r>
+        <w:rPr>
+          <w:rFonts w:ascii="Times New Roman" w:hAnsi="Times New Roman" w:cs="Times New Roman"/>
+          <w:bCs/>
+          <w:sz w:val="28"/>
+          <w:szCs w:val="28"/>
+        </w:rPr>
+        <w:t>В ходе работы предпринимались по</w:t>
+      </w:r>
+      <w:r>
+        <w:rPr>
+          <w:rFonts w:ascii="Times New Roman" w:hAnsi="Times New Roman" w:cs="Times New Roman"/>
+          <w:bCs/>
+          <w:sz w:val="28"/>
+          <w:szCs w:val="28"/>
+        </w:rPr>
+        <w:t>пытки:</w:t>
+      </w:r>
+    </w:p>
+    <w:p>
+      <w:pPr>
+        <w:rPr>
+          <w:rFonts w:ascii="Times New Roman" w:hAnsi="Times New Roman" w:cs="Times New Roman"/>
+          <w:bCs/>
+          <w:sz w:val="28"/>
+          <w:szCs w:val="28"/>
+        </w:rPr>
+      </w:pPr>
+      <w:r>
+        <w:rPr>
+          <w:rFonts w:ascii="Times New Roman" w:hAnsi="Times New Roman" w:cs="Times New Roman"/>
+          <w:bCs/>
+          <w:sz w:val="28"/>
+          <w:szCs w:val="28"/>
+        </w:rPr>
+        <w:t>1)</w:t>
+      </w:r>
+      <w:r>
+        <w:rPr>
+          <w:rFonts w:ascii="Times New Roman" w:hAnsi="Times New Roman" w:cs="Times New Roman"/>
+          <w:bCs/>
+          <w:sz w:val="28"/>
+          <w:szCs w:val="28"/>
+        </w:rPr>
+        <w:t xml:space="preserve">Автоматического извлечения заголовков разделов (Теорема, Лемма, </w:t>
+      </w:r>
+      <w:r>
+        <w:rPr>
+          <w:rFonts w:ascii="Times New Roman" w:hAnsi="Times New Roman" w:cs="Times New Roman"/>
+          <w:bCs/>
           <w:sz w:val="28"/>
           <w:szCs w:val="28"/>
         </w:rPr>
         <w:t xml:space="preserve"> </w:t>
       </w:r>
-      <w:proofErr w:type="spellStart"/>
-      <w:r>
-        <w:rPr>
-          <w:rFonts w:ascii="Times New Roman" w:hAnsi="Times New Roman" w:cs="Times New Roman"/>
-          <w:sz w:val="28"/>
-          <w:szCs w:val="28"/>
-        </w:rPr>
-        <w:t>Core</w:t>
-      </w:r>
-      <w:proofErr w:type="spellEnd"/>
-      <w:r>
-        <w:rPr>
-          <w:rFonts w:ascii="Times New Roman" w:hAnsi="Times New Roman" w:cs="Times New Roman"/>
-          <w:sz w:val="28"/>
-          <w:szCs w:val="28"/>
-        </w:rPr>
-        <w:t xml:space="preserve"> i5. Основное время ушло на распознавание формул через Pix2Text. При отключении распознавания формул время сокращается до ~20 секунд.</w:t>
-      </w:r>
-    </w:p>
-    <w:p>
-      <w:pPr>
-        <w:pStyle w:val="1"/>
-      </w:pPr>
-      <w:bookmarkStart w:id="11" w:name="_Toc230224540"/>
-      <w:r>
-        <w:t>4. Ограничения и нереализованные возможности</w:t>
-      </w:r>
-      <w:bookmarkEnd w:id="11"/>
-    </w:p>
-    <w:p>
-      <w:pPr>
+      <w:r>
         <w:rPr>
           <w:rFonts w:ascii="Times New Roman" w:hAnsi="Times New Roman" w:cs="Times New Roman"/>
           <w:bCs/>
           <w:sz w:val="28"/>
           <w:szCs w:val="28"/>
         </w:rPr>
-      </w:pPr>
-      <w:r>
+        <w:t>Доказательство и т.п.) с использованием анализа размера шрифта в pypdf и библиотек pymupdf4llm.</w:t>
+      </w:r>
+    </w:p>
+    <w:p>
+      <w:pPr>
         <w:rPr>
           <w:rFonts w:ascii="Times New Roman" w:hAnsi="Times New Roman" w:cs="Times New Roman"/>
           <w:bCs/>
           <w:sz w:val="28"/>
           <w:szCs w:val="28"/>
         </w:rPr>
-        <w:t>В ходе работы предпринимались по</w:t>
-      </w:r>
+      </w:pPr>
       <w:r>
         <w:rPr>
           <w:rFonts w:ascii="Times New Roman" w:hAnsi="Times New Roman" w:cs="Times New Roman"/>
@@ -3993,121 +3811,16 @@
           <w:sz w:val="28"/>
           <w:szCs w:val="28"/>
         </w:rPr>
-        <w:t>пытки:</w:t>
-      </w:r>
-    </w:p>
-    <w:p>
-      <w:pPr>
+        <w:t>2)</w:t>
+      </w:r>
+      <w:r>
         <w:rPr>
           <w:rFonts w:ascii="Times New Roman" w:hAnsi="Times New Roman" w:cs="Times New Roman"/>
           <w:bCs/>
           <w:sz w:val="28"/>
           <w:szCs w:val="28"/>
         </w:rPr>
-      </w:pPr>
-      <w:r>
-        <w:rPr>
-          <w:rFonts w:ascii="Times New Roman" w:hAnsi="Times New Roman" w:cs="Times New Roman"/>
-          <w:bCs/>
-          <w:sz w:val="28"/>
-          <w:szCs w:val="28"/>
-        </w:rPr>
-        <w:t>1)</w:t>
-      </w:r>
-      <w:r>
-        <w:rPr>
-          <w:rFonts w:ascii="Times New Roman" w:hAnsi="Times New Roman" w:cs="Times New Roman"/>
-          <w:bCs/>
-          <w:sz w:val="28"/>
-          <w:szCs w:val="28"/>
-        </w:rPr>
-        <w:t xml:space="preserve">Автоматического извлечения заголовков разделов (Теорема, </w:t>
-      </w:r>
-      <w:proofErr w:type="gramStart"/>
-      <w:r>
-        <w:rPr>
-          <w:rFonts w:ascii="Times New Roman" w:hAnsi="Times New Roman" w:cs="Times New Roman"/>
-          <w:bCs/>
-          <w:sz w:val="28"/>
-          <w:szCs w:val="28"/>
-        </w:rPr>
-        <w:t xml:space="preserve">Лемма, </w:t>
-      </w:r>
-      <w:r>
-        <w:rPr>
-          <w:rFonts w:ascii="Times New Roman" w:hAnsi="Times New Roman" w:cs="Times New Roman"/>
-          <w:bCs/>
-          <w:sz w:val="28"/>
-          <w:szCs w:val="28"/>
-        </w:rPr>
-        <w:t xml:space="preserve"> </w:t>
-      </w:r>
-      <w:r>
-        <w:rPr>
-          <w:rFonts w:ascii="Times New Roman" w:hAnsi="Times New Roman" w:cs="Times New Roman"/>
-          <w:bCs/>
-          <w:sz w:val="28"/>
-          <w:szCs w:val="28"/>
-        </w:rPr>
-        <w:t>Доказательство</w:t>
-      </w:r>
-      <w:proofErr w:type="gramEnd"/>
-      <w:r>
-        <w:rPr>
-          <w:rFonts w:ascii="Times New Roman" w:hAnsi="Times New Roman" w:cs="Times New Roman"/>
-          <w:bCs/>
-          <w:sz w:val="28"/>
-          <w:szCs w:val="28"/>
-        </w:rPr>
-        <w:t xml:space="preserve"> и т.п.) с использованием анализа размера шрифта в pypdf и библиотек pymupdf4llm.</w:t>
-      </w:r>
-    </w:p>
-    <w:p>
-      <w:pPr>
-        <w:rPr>
-          <w:rFonts w:ascii="Times New Roman" w:hAnsi="Times New Roman" w:cs="Times New Roman"/>
-          <w:bCs/>
-          <w:sz w:val="28"/>
-          <w:szCs w:val="28"/>
-        </w:rPr>
-      </w:pPr>
-      <w:r>
-        <w:rPr>
-          <w:rFonts w:ascii="Times New Roman" w:hAnsi="Times New Roman" w:cs="Times New Roman"/>
-          <w:bCs/>
-          <w:sz w:val="28"/>
-          <w:szCs w:val="28"/>
-        </w:rPr>
-        <w:t>2)</w:t>
-      </w:r>
-      <w:r>
-        <w:rPr>
-          <w:rFonts w:ascii="Times New Roman" w:hAnsi="Times New Roman" w:cs="Times New Roman"/>
-          <w:bCs/>
-          <w:sz w:val="28"/>
-          <w:szCs w:val="28"/>
-        </w:rPr>
-        <w:t xml:space="preserve">Распознавания формул в </w:t>
-      </w:r>
-      <w:proofErr w:type="spellStart"/>
-      <w:r>
-        <w:rPr>
-          <w:rFonts w:ascii="Times New Roman" w:hAnsi="Times New Roman" w:cs="Times New Roman"/>
-          <w:bCs/>
-          <w:sz w:val="28"/>
-          <w:szCs w:val="28"/>
-        </w:rPr>
-        <w:t>LaTeX</w:t>
-      </w:r>
-      <w:proofErr w:type="spellEnd"/>
-      <w:r>
-        <w:rPr>
-          <w:rFonts w:ascii="Times New Roman" w:hAnsi="Times New Roman" w:cs="Times New Roman"/>
-          <w:bCs/>
-          <w:sz w:val="28"/>
-          <w:szCs w:val="28"/>
-        </w:rPr>
-        <w:t>.</w:t>
+        <w:t>Распознавания формул в LaTeX.</w:t>
       </w:r>
     </w:p>
     <w:p>
@@ -4143,7 +3856,6 @@
           <w:szCs w:val="28"/>
         </w:rPr>
       </w:pPr>
-      <w:proofErr w:type="spellStart"/>
       <w:r>
         <w:rPr>
           <w:rFonts w:ascii="Times New Roman" w:hAnsi="Times New Roman" w:cs="Times New Roman"/>
@@ -4151,37 +3863,7 @@
           <w:sz w:val="28"/>
           <w:szCs w:val="28"/>
         </w:rPr>
-        <w:t>Texify</w:t>
-      </w:r>
-      <w:proofErr w:type="spellEnd"/>
-      <w:r>
-        <w:rPr>
-          <w:rFonts w:ascii="Times New Roman" w:hAnsi="Times New Roman" w:cs="Times New Roman"/>
-          <w:bCs/>
-          <w:sz w:val="28"/>
-          <w:szCs w:val="28"/>
-        </w:rPr>
-        <w:t xml:space="preserve"> – не удалось запустить из-за конфликта версий библиотек </w:t>
-      </w:r>
-      <w:proofErr w:type="spellStart"/>
-      <w:r>
-        <w:rPr>
-          <w:rFonts w:ascii="Times New Roman" w:hAnsi="Times New Roman" w:cs="Times New Roman"/>
-          <w:bCs/>
-          <w:sz w:val="28"/>
-          <w:szCs w:val="28"/>
-        </w:rPr>
-        <w:t>transformers</w:t>
-      </w:r>
-      <w:proofErr w:type="spellEnd"/>
-      <w:r>
-        <w:rPr>
-          <w:rFonts w:ascii="Times New Roman" w:hAnsi="Times New Roman" w:cs="Times New Roman"/>
-          <w:bCs/>
-          <w:sz w:val="28"/>
-          <w:szCs w:val="28"/>
-        </w:rPr>
-        <w:t>.</w:t>
+        <w:t>Texify – не удалось запустить из-за конфликта версий библиотек transformers.</w:t>
       </w:r>
     </w:p>
     <w:p>
@@ -4198,7 +3880,6 @@
           <w:szCs w:val="28"/>
         </w:rPr>
       </w:pPr>
-      <w:proofErr w:type="spellStart"/>
       <w:r>
         <w:rPr>
           <w:rFonts w:ascii="Times New Roman" w:hAnsi="Times New Roman" w:cs="Times New Roman"/>
@@ -4206,37 +3887,7 @@
           <w:sz w:val="28"/>
           <w:szCs w:val="28"/>
         </w:rPr>
-        <w:t>MinerU</w:t>
-      </w:r>
-      <w:proofErr w:type="spellEnd"/>
-      <w:r>
-        <w:rPr>
-          <w:rFonts w:ascii="Times New Roman" w:hAnsi="Times New Roman" w:cs="Times New Roman"/>
-          <w:bCs/>
-          <w:sz w:val="28"/>
-          <w:szCs w:val="28"/>
-        </w:rPr>
-        <w:t xml:space="preserve"> – требует доступа к GPU с 8+ ГБ видеопамяти, что недоступно на используемом оборудовании (NVIDIA RTX 3050 </w:t>
-      </w:r>
-      <w:proofErr w:type="spellStart"/>
-      <w:r>
-        <w:rPr>
-          <w:rFonts w:ascii="Times New Roman" w:hAnsi="Times New Roman" w:cs="Times New Roman"/>
-          <w:bCs/>
-          <w:sz w:val="28"/>
-          <w:szCs w:val="28"/>
-        </w:rPr>
-        <w:t>Ti</w:t>
-      </w:r>
-      <w:proofErr w:type="spellEnd"/>
-      <w:r>
-        <w:rPr>
-          <w:rFonts w:ascii="Times New Roman" w:hAnsi="Times New Roman" w:cs="Times New Roman"/>
-          <w:bCs/>
-          <w:sz w:val="28"/>
-          <w:szCs w:val="28"/>
-        </w:rPr>
-        <w:t xml:space="preserve"> с 4 ГБ).</w:t>
+        <w:t>MinerU – требует доступа к GPU с 8+ ГБ видеопамяти, что недоступно на используемом оборудовании (NVIDIA RTX 3050 Ti с 4 ГБ).</w:t>
       </w:r>
     </w:p>
     <w:p>
@@ -4288,47 +3939,7 @@
           <w:sz w:val="28"/>
           <w:szCs w:val="28"/>
         </w:rPr>
-        <w:t>ыли указаны языки ('</w:t>
-      </w:r>
-      <w:proofErr w:type="spellStart"/>
-      <w:r>
-        <w:rPr>
-          <w:rFonts w:ascii="Times New Roman" w:hAnsi="Times New Roman" w:cs="Times New Roman"/>
-          <w:bCs/>
-          <w:sz w:val="28"/>
-          <w:szCs w:val="28"/>
-        </w:rPr>
-        <w:t>ru</w:t>
-      </w:r>
-      <w:proofErr w:type="spellEnd"/>
-      <w:r>
-        <w:rPr>
-          <w:rFonts w:ascii="Times New Roman" w:hAnsi="Times New Roman" w:cs="Times New Roman"/>
-          <w:bCs/>
-          <w:sz w:val="28"/>
-          <w:szCs w:val="28"/>
-        </w:rPr>
-        <w:t>', '</w:t>
-      </w:r>
-      <w:proofErr w:type="spellStart"/>
-      <w:r>
-        <w:rPr>
-          <w:rFonts w:ascii="Times New Roman" w:hAnsi="Times New Roman" w:cs="Times New Roman"/>
-          <w:bCs/>
-          <w:sz w:val="28"/>
-          <w:szCs w:val="28"/>
-        </w:rPr>
-        <w:t>en</w:t>
-      </w:r>
-      <w:proofErr w:type="spellEnd"/>
-      <w:r>
-        <w:rPr>
-          <w:rFonts w:ascii="Times New Roman" w:hAnsi="Times New Roman" w:cs="Times New Roman"/>
-          <w:bCs/>
-          <w:sz w:val="28"/>
-          <w:szCs w:val="28"/>
-        </w:rPr>
-        <w:t xml:space="preserve">'). </w:t>
+        <w:t xml:space="preserve">ыли указаны языки ('ru', 'en'). </w:t>
       </w:r>
       <w:r>
         <w:rPr>
@@ -4392,9 +4003,8 @@
           <w:sz w:val="28"/>
           <w:szCs w:val="28"/>
         </w:rPr>
-        <w:t xml:space="preserve">нестабильным: в большом количестве случаев </w:t>
-      </w:r>
-      <w:proofErr w:type="spellStart"/>
+        <w:t xml:space="preserve">нестабильным: в большом количестве случаев LaTeX-код содержит </w:t>
+      </w:r>
       <w:r>
         <w:rPr>
           <w:rFonts w:ascii="Times New Roman" w:hAnsi="Times New Roman" w:cs="Times New Roman"/>
@@ -4402,9 +4012,8 @@
           <w:sz w:val="28"/>
           <w:szCs w:val="28"/>
         </w:rPr>
-        <w:t>LaTeX</w:t>
-      </w:r>
-      <w:proofErr w:type="spellEnd"/>
+        <w:t>неточности</w:t>
+      </w:r>
       <w:r>
         <w:rPr>
           <w:rFonts w:ascii="Times New Roman" w:hAnsi="Times New Roman" w:cs="Times New Roman"/>
@@ -4412,19 +4021,18 @@
           <w:sz w:val="28"/>
           <w:szCs w:val="28"/>
         </w:rPr>
-        <w:t xml:space="preserve">-код содержит </w:t>
-      </w:r>
-      <w:r>
+        <w:t xml:space="preserve">. Это объясняется ограничениями используемой модели. </w:t>
+      </w:r>
+    </w:p>
+    <w:p>
+      <w:pPr>
         <w:rPr>
           <w:rFonts w:ascii="Times New Roman" w:hAnsi="Times New Roman" w:cs="Times New Roman"/>
           <w:bCs/>
           <w:sz w:val="28"/>
           <w:szCs w:val="28"/>
         </w:rPr>
-        <w:t>неточности</w:t>
-      </w:r>
-      <w:bookmarkStart w:id="12" w:name="_GoBack"/>
-      <w:bookmarkEnd w:id="12"/>
+      </w:pPr>
       <w:r>
         <w:rPr>
           <w:rFonts w:ascii="Times New Roman" w:hAnsi="Times New Roman" w:cs="Times New Roman"/>
@@ -4432,46 +4040,7 @@
           <w:sz w:val="28"/>
           <w:szCs w:val="28"/>
         </w:rPr>
-        <w:t xml:space="preserve">. Это объясняется ограничениями используемой модели. </w:t>
-      </w:r>
-    </w:p>
-    <w:p>
-      <w:pPr>
-        <w:rPr>
-          <w:rFonts w:ascii="Times New Roman" w:hAnsi="Times New Roman" w:cs="Times New Roman"/>
-          <w:bCs/>
-          <w:sz w:val="28"/>
-          <w:szCs w:val="28"/>
-        </w:rPr>
-      </w:pPr>
-      <w:r>
-        <w:rPr>
-          <w:rFonts w:ascii="Times New Roman" w:hAnsi="Times New Roman" w:cs="Times New Roman"/>
-          <w:bCs/>
-          <w:sz w:val="28"/>
-          <w:szCs w:val="28"/>
-        </w:rPr>
-        <w:t xml:space="preserve">Авторы извлекаются с помощью библиотеки </w:t>
-      </w:r>
-      <w:proofErr w:type="spellStart"/>
-      <w:r>
-        <w:rPr>
-          <w:rFonts w:ascii="Times New Roman" w:hAnsi="Times New Roman" w:cs="Times New Roman"/>
-          <w:bCs/>
-          <w:sz w:val="28"/>
-          <w:szCs w:val="28"/>
-        </w:rPr>
-        <w:t>Natasha</w:t>
-      </w:r>
-      <w:proofErr w:type="spellEnd"/>
-      <w:r>
-        <w:rPr>
-          <w:rFonts w:ascii="Times New Roman" w:hAnsi="Times New Roman" w:cs="Times New Roman"/>
-          <w:bCs/>
-          <w:sz w:val="28"/>
-          <w:szCs w:val="28"/>
-        </w:rPr>
-        <w:t>. В 4 из 40 файлов авторы не были найдены из-за нестандартного оформления первой страницы (отсутствие инициалов, расположение после аннотации). Это является ограничением используемого подхода.</w:t>
+        <w:t>Авторы извлекаются с помощью библиотеки Natasha. В 4 из 40 файлов авторы не были найдены из-за нестандартного оформления первой страницы (отсутствие инициалов, расположение после аннотации). Это является ограничением используемого подхода.</w:t>
       </w:r>
     </w:p>
     <w:p>
@@ -4671,23 +4240,7 @@
           <w:rFonts w:ascii="Times New Roman" w:hAnsi="Times New Roman" w:cs="Times New Roman"/>
           <w:sz w:val="28"/>
         </w:rPr>
-        <w:t xml:space="preserve">ов с помощью библиотеки </w:t>
-      </w:r>
-      <w:proofErr w:type="spellStart"/>
-      <w:r>
-        <w:rPr>
-          <w:rFonts w:ascii="Times New Roman" w:hAnsi="Times New Roman" w:cs="Times New Roman"/>
-          <w:sz w:val="28"/>
-        </w:rPr>
-        <w:t>Natasha</w:t>
-      </w:r>
-      <w:proofErr w:type="spellEnd"/>
-      <w:r>
-        <w:rPr>
-          <w:rFonts w:ascii="Times New Roman" w:hAnsi="Times New Roman" w:cs="Times New Roman"/>
-          <w:sz w:val="28"/>
-        </w:rPr>
-        <w:t>.</w:t>
+        <w:t>ов с помощью библиотеки Natasha.</w:t>
       </w:r>
     </w:p>
     <w:p>
@@ -4707,23 +4260,7 @@
           <w:rFonts w:ascii="Times New Roman" w:hAnsi="Times New Roman" w:cs="Times New Roman"/>
           <w:sz w:val="28"/>
         </w:rPr>
-        <w:t xml:space="preserve">Реализовано распознавание формул в </w:t>
-      </w:r>
-      <w:proofErr w:type="spellStart"/>
-      <w:r>
-        <w:rPr>
-          <w:rFonts w:ascii="Times New Roman" w:hAnsi="Times New Roman" w:cs="Times New Roman"/>
-          <w:sz w:val="28"/>
-        </w:rPr>
-        <w:t>LaTeX</w:t>
-      </w:r>
-      <w:proofErr w:type="spellEnd"/>
-      <w:r>
-        <w:rPr>
-          <w:rFonts w:ascii="Times New Roman" w:hAnsi="Times New Roman" w:cs="Times New Roman"/>
-          <w:sz w:val="28"/>
-        </w:rPr>
-        <w:t xml:space="preserve"> с помощью Pix2Text.</w:t>
+        <w:t>Реализовано распознавание формул в LaTeX с помощью Pix2Text.</w:t>
       </w:r>
     </w:p>
     <w:p>
@@ -4766,13 +4303,8 @@
         <w:jc w:val="center"/>
       </w:pPr>
       <w:bookmarkStart w:id="14" w:name="_Toc230224542"/>
-    </w:p>
-    <w:p>
-      <w:pPr>
-        <w:pStyle w:val="1"/>
-        <w:jc w:val="center"/>
-      </w:pPr>
-      <w:r>
+      <w:r>
+        <w:lastRenderedPageBreak/>
         <w:t>Заключение</w:t>
       </w:r>
       <w:bookmarkEnd w:id="14"/>
@@ -4804,23 +4336,7 @@
           <w:rFonts w:ascii="Times New Roman" w:hAnsi="Times New Roman" w:cs="Times New Roman"/>
           <w:sz w:val="28"/>
         </w:rPr>
-        <w:t xml:space="preserve">Скрипт успешно протестирован на 40 реальных математических статьях. Полученный </w:t>
-      </w:r>
-      <w:proofErr w:type="spellStart"/>
-      <w:r>
-        <w:rPr>
-          <w:rFonts w:ascii="Times New Roman" w:hAnsi="Times New Roman" w:cs="Times New Roman"/>
-          <w:sz w:val="28"/>
-        </w:rPr>
-        <w:t>датасет</w:t>
-      </w:r>
-      <w:proofErr w:type="spellEnd"/>
-      <w:r>
-        <w:rPr>
-          <w:rFonts w:ascii="Times New Roman" w:hAnsi="Times New Roman" w:cs="Times New Roman"/>
-          <w:sz w:val="28"/>
-        </w:rPr>
-        <w:t xml:space="preserve"> может быть использован для дальнейшей ручной или автоматической разметки.</w:t>
+        <w:t>Скрипт успешно протестирован на 40 реальных математических статьях. Полученный датасет может быть использован для дальнейшей ручной или автоматической разметки.</w:t>
       </w:r>
     </w:p>
     <w:p>
@@ -4845,7 +4361,7 @@
         <w:pStyle w:val="a7"/>
         <w:numPr>
           <w:ilvl w:val="0"/>
-          <w:numId w:val="13"/>
+          <w:numId w:val="15"/>
         </w:numPr>
         <w:rPr>
           <w:rFonts w:ascii="Times New Roman" w:hAnsi="Times New Roman" w:cs="Times New Roman"/>
@@ -4857,25 +4373,15 @@
           <w:rFonts w:ascii="Times New Roman" w:hAnsi="Times New Roman" w:cs="Times New Roman"/>
           <w:sz w:val="28"/>
         </w:rPr>
-        <w:t>pypdf — библиотека для работы с PDF на Python. URL: </w:t>
-      </w:r>
-      <w:hyperlink r:id="rId6" w:tgtFrame="_blank" w:history="1">
-        <w:r>
-          <w:rPr>
-            <w:rStyle w:val="ad"/>
-            <w:rFonts w:ascii="Times New Roman" w:hAnsi="Times New Roman" w:cs="Times New Roman"/>
-            <w:sz w:val="28"/>
-          </w:rPr>
-          <w:t>https://pypdf.readthedocs.io/</w:t>
-        </w:r>
-      </w:hyperlink>
+        <w:t>pypdf : Библиотека для работы с PDF на Python. [Электронный ресурс] // PyPI. - URL: https://pypi.org/project/pypdf/ (дата обращения: 26.05.2026). - Текст : электронный.</w:t>
+      </w:r>
     </w:p>
     <w:p>
       <w:pPr>
         <w:pStyle w:val="a7"/>
         <w:numPr>
           <w:ilvl w:val="0"/>
-          <w:numId w:val="13"/>
+          <w:numId w:val="15"/>
         </w:numPr>
         <w:rPr>
           <w:rFonts w:ascii="Times New Roman" w:hAnsi="Times New Roman" w:cs="Times New Roman"/>
@@ -4887,127 +4393,63 @@
           <w:rFonts w:ascii="Times New Roman" w:hAnsi="Times New Roman" w:cs="Times New Roman"/>
           <w:sz w:val="28"/>
         </w:rPr>
-        <w:t>Документация по регулярным выражениям Python. URL: </w:t>
-      </w:r>
-      <w:hyperlink r:id="rId7" w:tgtFrame="_blank" w:history="1">
-        <w:r>
-          <w:rPr>
-            <w:rStyle w:val="ad"/>
-            <w:rFonts w:ascii="Times New Roman" w:hAnsi="Times New Roman" w:cs="Times New Roman"/>
-            <w:sz w:val="28"/>
-          </w:rPr>
-          <w:t>https://docs.python.org/3/library/re.html</w:t>
-        </w:r>
-      </w:hyperlink>
+        <w:t>PyMuPDF : Документация. [Электронный ресурс] // PyMuPDF. - URL: https://pymupdf.readthedocs.io/ (дата обращения: 26.05.2026). - Текст : электронный.</w:t>
+      </w:r>
     </w:p>
     <w:p>
       <w:pPr>
         <w:pStyle w:val="a7"/>
         <w:numPr>
           <w:ilvl w:val="0"/>
-          <w:numId w:val="13"/>
+          <w:numId w:val="15"/>
         </w:numPr>
         <w:rPr>
           <w:rFonts w:ascii="Times New Roman" w:hAnsi="Times New Roman" w:cs="Times New Roman"/>
           <w:sz w:val="28"/>
         </w:rPr>
       </w:pPr>
-      <w:proofErr w:type="spellStart"/>
-      <w:r>
-        <w:rPr>
-          <w:rFonts w:ascii="Times New Roman" w:hAnsi="Times New Roman" w:cs="Times New Roman"/>
-          <w:sz w:val="28"/>
-        </w:rPr>
-        <w:t>Texify</w:t>
-      </w:r>
-      <w:proofErr w:type="spellEnd"/>
-      <w:r>
-        <w:rPr>
-          <w:rFonts w:ascii="Times New Roman" w:hAnsi="Times New Roman" w:cs="Times New Roman"/>
-          <w:sz w:val="28"/>
-        </w:rPr>
-        <w:t xml:space="preserve"> — OCR для математических формул. URL: </w:t>
-      </w:r>
-      <w:hyperlink r:id="rId8" w:tgtFrame="_blank" w:history="1">
-        <w:r>
-          <w:rPr>
-            <w:rStyle w:val="ad"/>
-            <w:rFonts w:ascii="Times New Roman" w:hAnsi="Times New Roman" w:cs="Times New Roman"/>
-            <w:sz w:val="28"/>
-          </w:rPr>
-          <w:t>https://github.com/VikParuchuri/texify</w:t>
-        </w:r>
-      </w:hyperlink>
+      <w:r>
+        <w:rPr>
+          <w:rFonts w:ascii="Times New Roman" w:hAnsi="Times New Roman" w:cs="Times New Roman"/>
+          <w:sz w:val="28"/>
+          <w:lang w:val="en-US"/>
+        </w:rPr>
+        <w:t xml:space="preserve">Pix2Text : Pix2Text (P2T): A Free and Open-Source Python Alternative to Mathpix. </w:t>
+      </w:r>
+      <w:r>
+        <w:rPr>
+          <w:rFonts w:ascii="Times New Roman" w:hAnsi="Times New Roman" w:cs="Times New Roman"/>
+          <w:sz w:val="28"/>
+        </w:rPr>
+        <w:t>[Электронный ресурс] // GitHub. - URL: https://github.com/breezedeus/pix2text (дата обращения: 26.05.2026). - Текст : электронный.</w:t>
+      </w:r>
     </w:p>
     <w:p>
       <w:pPr>
         <w:pStyle w:val="a7"/>
         <w:numPr>
           <w:ilvl w:val="0"/>
-          <w:numId w:val="13"/>
+          <w:numId w:val="15"/>
         </w:numPr>
         <w:rPr>
-          <w:rStyle w:val="ad"/>
-          <w:rFonts w:ascii="Times New Roman" w:hAnsi="Times New Roman" w:cs="Times New Roman"/>
-          <w:color w:val="auto"/>
-          <w:sz w:val="28"/>
-          <w:u w:val="none"/>
-        </w:rPr>
-      </w:pPr>
-      <w:r>
-        <w:rPr>
-          <w:rFonts w:ascii="Times New Roman" w:hAnsi="Times New Roman" w:cs="Times New Roman"/>
-          <w:sz w:val="28"/>
-        </w:rPr>
-        <w:t>P</w:t>
-      </w:r>
-      <w:r>
-        <w:rPr>
-          <w:rFonts w:ascii="Times New Roman" w:hAnsi="Times New Roman" w:cs="Times New Roman"/>
-          <w:sz w:val="28"/>
-        </w:rPr>
-        <w:t xml:space="preserve">ix2Text — альтернатива </w:t>
-      </w:r>
-      <w:proofErr w:type="spellStart"/>
-      <w:r>
-        <w:rPr>
-          <w:rFonts w:ascii="Times New Roman" w:hAnsi="Times New Roman" w:cs="Times New Roman"/>
-          <w:sz w:val="28"/>
-        </w:rPr>
-        <w:t>Mathpix</w:t>
-      </w:r>
-      <w:proofErr w:type="spellEnd"/>
-      <w:r>
-        <w:rPr>
-          <w:rFonts w:ascii="Times New Roman" w:hAnsi="Times New Roman" w:cs="Times New Roman"/>
-          <w:sz w:val="28"/>
-        </w:rPr>
-        <w:t xml:space="preserve">. </w:t>
-      </w:r>
-      <w:r>
-        <w:rPr>
-          <w:rFonts w:ascii="Times New Roman" w:hAnsi="Times New Roman" w:cs="Times New Roman"/>
-          <w:sz w:val="28"/>
-        </w:rPr>
-        <w:t>URL: </w:t>
-      </w:r>
-      <w:hyperlink r:id="rId9" w:tgtFrame="_blank" w:history="1">
-        <w:r>
-          <w:rPr>
-            <w:rStyle w:val="ad"/>
-            <w:rFonts w:ascii="Times New Roman" w:hAnsi="Times New Roman" w:cs="Times New Roman"/>
-            <w:sz w:val="28"/>
-          </w:rPr>
-          <w:t>https://github.com/breezedeus/Pix2Text</w:t>
-        </w:r>
-      </w:hyperlink>
+          <w:rFonts w:ascii="Times New Roman" w:hAnsi="Times New Roman" w:cs="Times New Roman"/>
+          <w:sz w:val="28"/>
+        </w:rPr>
+      </w:pPr>
+      <w:r>
+        <w:rPr>
+          <w:rFonts w:ascii="Times New Roman" w:hAnsi="Times New Roman" w:cs="Times New Roman"/>
+          <w:sz w:val="28"/>
+        </w:rPr>
+        <w:t>Pix2Text-Demo : Демонстрационное пространство модели. [Электронный ресурс] // Hugging Face. - URL: https://huggingface.co/spaces/aci11/Pix2Text-Demo (дата обращения: 26.05.2026). - Текст : электронный.</w:t>
+      </w:r>
     </w:p>
     <w:p>
       <w:pPr>
         <w:pStyle w:val="a7"/>
         <w:numPr>
           <w:ilvl w:val="0"/>
-          <w:numId w:val="13"/>
+          <w:numId w:val="15"/>
         </w:numPr>
         <w:rPr>
           <w:rFonts w:ascii="Times New Roman" w:hAnsi="Times New Roman" w:cs="Times New Roman"/>
@@ -5020,134 +4462,130 @@
           <w:sz w:val="28"/>
           <w:lang w:val="en-US"/>
         </w:rPr>
-        <w:t>Natasha</w:t>
-      </w:r>
-      <w:r>
-        <w:rPr>
-          <w:rFonts w:ascii="Times New Roman" w:hAnsi="Times New Roman" w:cs="Times New Roman"/>
-          <w:sz w:val="28"/>
-        </w:rPr>
-        <w:t xml:space="preserve"> — библиотека для извлечения именованных сущностей из русского текста. </w:t>
-      </w:r>
-      <w:r>
-        <w:rPr>
-          <w:rFonts w:ascii="Times New Roman" w:hAnsi="Times New Roman" w:cs="Times New Roman"/>
-          <w:sz w:val="28"/>
-          <w:lang w:val="en-US"/>
-        </w:rPr>
-        <w:t>URL</w:t>
-      </w:r>
-      <w:r>
-        <w:rPr>
-          <w:rFonts w:ascii="Times New Roman" w:hAnsi="Times New Roman" w:cs="Times New Roman"/>
-          <w:sz w:val="28"/>
-        </w:rPr>
-        <w:t xml:space="preserve">: </w:t>
-      </w:r>
-      <w:r>
-        <w:rPr>
-          <w:rFonts w:ascii="Times New Roman" w:hAnsi="Times New Roman" w:cs="Times New Roman"/>
-          <w:sz w:val="28"/>
-          <w:lang w:val="en-US"/>
-        </w:rPr>
-        <w:t>https</w:t>
-      </w:r>
-      <w:r>
-        <w:rPr>
-          <w:rFonts w:ascii="Times New Roman" w:hAnsi="Times New Roman" w:cs="Times New Roman"/>
-          <w:sz w:val="28"/>
-        </w:rPr>
-        <w:t>://</w:t>
-      </w:r>
-      <w:proofErr w:type="spellStart"/>
-      <w:r>
-        <w:rPr>
-          <w:rFonts w:ascii="Times New Roman" w:hAnsi="Times New Roman" w:cs="Times New Roman"/>
-          <w:sz w:val="28"/>
-          <w:lang w:val="en-US"/>
-        </w:rPr>
-        <w:t>github</w:t>
-      </w:r>
-      <w:proofErr w:type="spellEnd"/>
-      <w:r>
-        <w:rPr>
-          <w:rFonts w:ascii="Times New Roman" w:hAnsi="Times New Roman" w:cs="Times New Roman"/>
-          <w:sz w:val="28"/>
-        </w:rPr>
-        <w:t>.</w:t>
-      </w:r>
-      <w:r>
-        <w:rPr>
-          <w:rFonts w:ascii="Times New Roman" w:hAnsi="Times New Roman" w:cs="Times New Roman"/>
-          <w:sz w:val="28"/>
-          <w:lang w:val="en-US"/>
-        </w:rPr>
-        <w:t>com</w:t>
-      </w:r>
-      <w:r>
-        <w:rPr>
-          <w:rFonts w:ascii="Times New Roman" w:hAnsi="Times New Roman" w:cs="Times New Roman"/>
-          <w:sz w:val="28"/>
-        </w:rPr>
-        <w:t>/</w:t>
-      </w:r>
-      <w:proofErr w:type="spellStart"/>
-      <w:r>
-        <w:rPr>
-          <w:rFonts w:ascii="Times New Roman" w:hAnsi="Times New Roman" w:cs="Times New Roman"/>
-          <w:sz w:val="28"/>
-          <w:lang w:val="en-US"/>
-        </w:rPr>
-        <w:t>natasha</w:t>
-      </w:r>
-      <w:proofErr w:type="spellEnd"/>
-      <w:r>
-        <w:rPr>
-          <w:rFonts w:ascii="Times New Roman" w:hAnsi="Times New Roman" w:cs="Times New Roman"/>
-          <w:sz w:val="28"/>
-        </w:rPr>
-        <w:t>/</w:t>
-      </w:r>
-      <w:proofErr w:type="spellStart"/>
-      <w:r>
-        <w:rPr>
-          <w:rFonts w:ascii="Times New Roman" w:hAnsi="Times New Roman" w:cs="Times New Roman"/>
-          <w:sz w:val="28"/>
-          <w:lang w:val="en-US"/>
-        </w:rPr>
-        <w:t>natasha</w:t>
-      </w:r>
-      <w:proofErr w:type="spellEnd"/>
+        <w:t xml:space="preserve">Texify : Texify: OCR Model for Converting Images/PDFs with Math into Markdown and LaTeX. </w:t>
+      </w:r>
+      <w:r>
+        <w:rPr>
+          <w:rFonts w:ascii="Times New Roman" w:hAnsi="Times New Roman" w:cs="Times New Roman"/>
+          <w:sz w:val="28"/>
+        </w:rPr>
+        <w:t>[Электронный ресурс] // GitHub. - URL: https://github.com/VikParuchuri/texify (дата обращения: 26.05.2026). - Текст : электронный.</w:t>
+      </w:r>
     </w:p>
     <w:p>
       <w:pPr>
         <w:pStyle w:val="a7"/>
         <w:numPr>
           <w:ilvl w:val="0"/>
-          <w:numId w:val="13"/>
+          <w:numId w:val="15"/>
         </w:numPr>
         <w:rPr>
           <w:rFonts w:ascii="Times New Roman" w:hAnsi="Times New Roman" w:cs="Times New Roman"/>
           <w:sz w:val="28"/>
+        </w:rPr>
+      </w:pPr>
+      <w:r>
+        <w:rPr>
+          <w:rFonts w:ascii="Times New Roman" w:hAnsi="Times New Roman" w:cs="Times New Roman"/>
+          <w:sz w:val="28"/>
+        </w:rPr>
+        <w:t>MinerU2.5 : Официальная страница модели на Hugging Face. [Электронный ресурс] // Hugging Face. - URL: https://huggingface.co/opendatalab/MinerU2.5-2509-1.2B (дата обращения: 26.05.2026). - Текст : электронный.</w:t>
+      </w:r>
+    </w:p>
+    <w:p>
+      <w:pPr>
+        <w:pStyle w:val="a7"/>
+        <w:numPr>
+          <w:ilvl w:val="0"/>
+          <w:numId w:val="15"/>
+        </w:numPr>
+        <w:rPr>
+          <w:rFonts w:ascii="Times New Roman" w:hAnsi="Times New Roman" w:cs="Times New Roman"/>
+          <w:sz w:val="28"/>
+        </w:rPr>
+      </w:pPr>
+      <w:r>
+        <w:rPr>
+          <w:rFonts w:ascii="Times New Roman" w:hAnsi="Times New Roman" w:cs="Times New Roman"/>
+          <w:sz w:val="28"/>
+        </w:rPr>
+        <w:t>Natasha : Библиотека для извлечения именованных сущностей из русского текста. [Электронный ресурс] // GitHub. - URL: https://github.com/natasha/natasha (дата обращения: 26.05.2026). - Текст : электронный.</w:t>
+      </w:r>
+    </w:p>
+    <w:p>
+      <w:pPr>
+        <w:pStyle w:val="a7"/>
+        <w:numPr>
+          <w:ilvl w:val="0"/>
+          <w:numId w:val="15"/>
+        </w:numPr>
+        <w:rPr>
+          <w:rFonts w:ascii="Times New Roman" w:hAnsi="Times New Roman" w:cs="Times New Roman"/>
+          <w:sz w:val="28"/>
+        </w:rPr>
+      </w:pPr>
+      <w:r>
+        <w:rPr>
+          <w:rFonts w:ascii="Times New Roman" w:hAnsi="Times New Roman" w:cs="Times New Roman"/>
+          <w:sz w:val="28"/>
           <w:lang w:val="en-US"/>
         </w:rPr>
-      </w:pPr>
-      <w:proofErr w:type="spellStart"/>
+        <w:t xml:space="preserve">Pillow : Pillow (PIL Fork) Documentation. </w:t>
+      </w:r>
+      <w:r>
+        <w:rPr>
+          <w:rFonts w:ascii="Times New Roman" w:hAnsi="Times New Roman" w:cs="Times New Roman"/>
+          <w:sz w:val="28"/>
+        </w:rPr>
+        <w:t>[Электронный ресурс] // Pillow. - URL: https://pillow.readthedocs.io/ (дата обращения: 26.05.2026). - Текст : электронный.</w:t>
+      </w:r>
+    </w:p>
+    <w:p>
+      <w:pPr>
+        <w:pStyle w:val="a7"/>
+        <w:numPr>
+          <w:ilvl w:val="0"/>
+          <w:numId w:val="15"/>
+        </w:numPr>
+        <w:rPr>
+          <w:rFonts w:ascii="Times New Roman" w:hAnsi="Times New Roman" w:cs="Times New Roman"/>
+          <w:sz w:val="28"/>
+        </w:rPr>
+      </w:pPr>
+      <w:r>
+        <w:rPr>
+          <w:rFonts w:ascii="Times New Roman" w:hAnsi="Times New Roman" w:cs="Times New Roman"/>
+          <w:sz w:val="28"/>
+        </w:rPr>
+        <w:t>Python Software Foundation : re - Операции с регулярными выражениями. [Электронный ресурс] // Документация Python 3.10+. - URL: https://docs.python.org/3/library/re.html (дата обращения: 26.05.2026). - Текст : электронный.</w:t>
+      </w:r>
+    </w:p>
+    <w:p>
+      <w:pPr>
+        <w:pStyle w:val="a7"/>
+        <w:numPr>
+          <w:ilvl w:val="0"/>
+          <w:numId w:val="15"/>
+        </w:numPr>
+        <w:rPr>
+          <w:rFonts w:ascii="Times New Roman" w:hAnsi="Times New Roman" w:cs="Times New Roman"/>
+          <w:sz w:val="28"/>
+        </w:rPr>
+      </w:pPr>
       <w:r>
         <w:rPr>
           <w:rFonts w:ascii="Times New Roman" w:hAnsi="Times New Roman" w:cs="Times New Roman"/>
           <w:sz w:val="28"/>
           <w:lang w:val="en-US"/>
         </w:rPr>
-        <w:t>PyMuPDF</w:t>
-      </w:r>
-      <w:proofErr w:type="spellEnd"/>
-      <w:r>
-        <w:rPr>
-          <w:rFonts w:ascii="Times New Roman" w:hAnsi="Times New Roman" w:cs="Times New Roman"/>
-          <w:sz w:val="28"/>
-        </w:rPr>
-        <w:t xml:space="preserve"> — библиотека для работы с </w:t>
+        <w:t xml:space="preserve">Python Software Foundation : json - </w:t>
+      </w:r>
+      <w:r>
+        <w:rPr>
+          <w:rFonts w:ascii="Times New Roman" w:hAnsi="Times New Roman" w:cs="Times New Roman"/>
+          <w:sz w:val="28"/>
+        </w:rPr>
+        <w:t>Кодировщик</w:t>
       </w:r>
       <w:r>
         <w:rPr>
@@ -5155,14 +4593,14 @@
           <w:sz w:val="28"/>
           <w:lang w:val="en-US"/>
         </w:rPr>
-        <w:t>PDF</w:t>
-      </w:r>
-      <w:r>
-        <w:rPr>
-          <w:rFonts w:ascii="Times New Roman" w:hAnsi="Times New Roman" w:cs="Times New Roman"/>
-          <w:sz w:val="28"/>
-        </w:rPr>
-        <w:t xml:space="preserve"> и рендеринга страниц. </w:t>
+        <w:t xml:space="preserve"> </w:t>
+      </w:r>
+      <w:r>
+        <w:rPr>
+          <w:rFonts w:ascii="Times New Roman" w:hAnsi="Times New Roman" w:cs="Times New Roman"/>
+          <w:sz w:val="28"/>
+        </w:rPr>
+        <w:t>и</w:t>
       </w:r>
       <w:r>
         <w:rPr>
@@ -5170,16 +4608,32 @@
           <w:sz w:val="28"/>
           <w:lang w:val="en-US"/>
         </w:rPr>
-        <w:t>URL: https://pymupdf.readthedocs.io/</w:t>
-      </w:r>
-    </w:p>
-    <w:p>
-      <w:pPr>
-        <w:rPr>
+        <w:t xml:space="preserve"> </w:t>
+      </w:r>
+      <w:r>
+        <w:rPr>
+          <w:rFonts w:ascii="Times New Roman" w:hAnsi="Times New Roman" w:cs="Times New Roman"/>
+          <w:sz w:val="28"/>
+        </w:rPr>
+        <w:t>декодер</w:t>
+      </w:r>
+      <w:r>
+        <w:rPr>
+          <w:rFonts w:ascii="Times New Roman" w:hAnsi="Times New Roman" w:cs="Times New Roman"/>
+          <w:sz w:val="28"/>
           <w:lang w:val="en-US"/>
         </w:rPr>
-      </w:pPr>
-    </w:p>
+        <w:t xml:space="preserve"> JSON. </w:t>
+      </w:r>
+      <w:r>
+        <w:rPr>
+          <w:rFonts w:ascii="Times New Roman" w:hAnsi="Times New Roman" w:cs="Times New Roman"/>
+          <w:sz w:val="28"/>
+        </w:rPr>
+        <w:t>[Электронный ресурс] // Документация Python 3.10+. - URL: https://docs.python.org/3/library/json.html (дата обращения: 26.05.2026). - Текст : электронный.</w:t>
+      </w:r>
+    </w:p>
+    <w:p/>
     <w:sectPr>
       <w:pgSz w:w="11906" w:h="16838"/>
       <w:pgMar w:top="1134" w:right="850" w:bottom="1134" w:left="1701" w:header="708" w:footer="708" w:gutter="0"/>
@@ -5190,6 +4644,56 @@
 </w:document>
 </file>
 
+<file path=word/endnotes.xml><?xml version="1.0" encoding="utf-8"?>
+<w:endnotes xmlns:wpc="http://schemas.microsoft.com/office/word/2010/wordprocessingCanvas" xmlns:cx="http://schemas.microsoft.com/office/drawing/2014/chartex" xmlns:mc="http://schemas.openxmlformats.org/markup-compatibility/2006" xmlns:o="urn:schemas-microsoft-com:office:office" xmlns:r="http://schemas.openxmlformats.org/officeDocument/2006/relationships" xmlns:m="http://schemas.openxmlformats.org/officeDocument/2006/math" xmlns:v="urn:schemas-microsoft-com:vml" xmlns:wp14="http://schemas.microsoft.com/office/word/2010/wordprocessingDrawing" xmlns:wp="http://schemas.openxmlformats.org/drawingml/2006/wordprocessingDrawing" xmlns:w10="urn:schemas-microsoft-com:office:word" xmlns:w="http://schemas.openxmlformats.org/wordprocessingml/2006/main" xmlns:w14="http://schemas.microsoft.com/office/word/2010/wordml" xmlns:w15="http://schemas.microsoft.com/office/word/2012/wordml" xmlns:w16se="http://schemas.microsoft.com/office/word/2015/wordml/symex" xmlns:wpg="http://schemas.microsoft.com/office/word/2010/wordprocessingGroup" xmlns:wpi="http://schemas.microsoft.com/office/word/2010/wordprocessingInk" xmlns:wne="http://schemas.microsoft.com/office/word/2006/wordml" xmlns:wps="http://schemas.microsoft.com/office/word/2010/wordprocessingShape" mc:Ignorable="w14 w15 w16se wp14">
+  <w:endnote w:type="separator" w:id="-1">
+    <w:p>
+      <w:pPr>
+        <w:spacing w:after="0" w:line="240" w:lineRule="auto"/>
+      </w:pPr>
+      <w:r>
+        <w:separator/>
+      </w:r>
+    </w:p>
+  </w:endnote>
+  <w:endnote w:type="continuationSeparator" w:id="0">
+    <w:p>
+      <w:pPr>
+        <w:spacing w:after="0" w:line="240" w:lineRule="auto"/>
+      </w:pPr>
+      <w:r>
+        <w:continuationSeparator/>
+      </w:r>
+    </w:p>
+  </w:endnote>
+</w:endnotes>
+</file>
+
+<file path=word/footnotes.xml><?xml version="1.0" encoding="utf-8"?>
+<w:footnotes xmlns:wpc="http://schemas.microsoft.com/office/word/2010/wordprocessingCanvas" xmlns:cx="http://schemas.microsoft.com/office/drawing/2014/chartex" xmlns:mc="http://schemas.openxmlformats.org/markup-compatibility/2006" xmlns:o="urn:schemas-microsoft-com:office:office" xmlns:r="http://schemas.openxmlformats.org/officeDocument/2006/relationships" xmlns:m="http://schemas.openxmlformats.org/officeDocument/2006/math" xmlns:v="urn:schemas-microsoft-com:vml" xmlns:wp14="http://schemas.microsoft.com/office/word/2010/wordprocessingDrawing" xmlns:wp="http://schemas.openxmlformats.org/drawingml/2006/wordprocessingDrawing" xmlns:w10="urn:schemas-microsoft-com:office:word" xmlns:w="http://schemas.openxmlformats.org/wordprocessingml/2006/main" xmlns:w14="http://schemas.microsoft.com/office/word/2010/wordml" xmlns:w15="http://schemas.microsoft.com/office/word/2012/wordml" xmlns:w16se="http://schemas.microsoft.com/office/word/2015/wordml/symex" xmlns:wpg="http://schemas.microsoft.com/office/word/2010/wordprocessingGroup" xmlns:wpi="http://schemas.microsoft.com/office/word/2010/wordprocessingInk" xmlns:wne="http://schemas.microsoft.com/office/word/2006/wordml" xmlns:wps="http://schemas.microsoft.com/office/word/2010/wordprocessingShape" mc:Ignorable="w14 w15 w16se wp14">
+  <w:footnote w:type="separator" w:id="-1">
+    <w:p>
+      <w:pPr>
+        <w:spacing w:after="0" w:line="240" w:lineRule="auto"/>
+      </w:pPr>
+      <w:r>
+        <w:separator/>
+      </w:r>
+    </w:p>
+  </w:footnote>
+  <w:footnote w:type="continuationSeparator" w:id="0">
+    <w:p>
+      <w:pPr>
+        <w:spacing w:after="0" w:line="240" w:lineRule="auto"/>
+      </w:pPr>
+      <w:r>
+        <w:continuationSeparator/>
+      </w:r>
+    </w:p>
+  </w:footnote>
+</w:footnotes>
+</file>
+
 <file path=word/numbering.xml><?xml version="1.0" encoding="utf-8"?>
 <w:numbering xmlns:wpc="http://schemas.microsoft.com/office/word/2010/wordprocessingCanvas" xmlns:cx="http://schemas.microsoft.com/office/drawing/2014/chartex" xmlns:mc="http://schemas.openxmlformats.org/markup-compatibility/2006" xmlns:o="urn:schemas-microsoft-com:office:office" xmlns:r="http://schemas.openxmlformats.org/officeDocument/2006/relationships" xmlns:m="http://schemas.openxmlformats.org/officeDocument/2006/math" xmlns:v="urn:schemas-microsoft-com:vml" xmlns:wp14="http://schemas.microsoft.com/office/word/2010/wordprocessingDrawing" xmlns:wp="http://schemas.openxmlformats.org/drawingml/2006/wordprocessingDrawing" xmlns:w10="urn:schemas-microsoft-com:office:word" xmlns:w="http://schemas.openxmlformats.org/wordprocessingml/2006/main" xmlns:w14="http://schemas.microsoft.com/office/word/2010/wordml" xmlns:w15="http://schemas.microsoft.com/office/word/2012/wordml" xmlns:w16se="http://schemas.microsoft.com/office/word/2015/wordml/symex" xmlns:wpg="http://schemas.microsoft.com/office/word/2010/wordprocessingGroup" xmlns:wpi="http://schemas.microsoft.com/office/word/2010/wordprocessingInk" xmlns:wne="http://schemas.microsoft.com/office/word/2006/wordml" xmlns:wps="http://schemas.microsoft.com/office/word/2010/wordprocessingShape" mc:Ignorable="w14 w15 w16se wp14">
   <w:abstractNum w:abstractNumId="0" w15:restartNumberingAfterBreak="0">
@@ -5753,6 +5257,92 @@
     </w:lvl>
   </w:abstractNum>
   <w:abstractNum w:abstractNumId="4" w15:restartNumberingAfterBreak="0">
+    <w:nsid w:val="2C475723"/>
+    <w:multiLevelType w:val="hybridMultilevel"/>
+    <w:tmpl w:val="AC16412C"/>
+    <w:lvl w:ilvl="0" w:tplc="0419000F">
+      <w:start w:val="1"/>
+      <w:numFmt w:val="decimal"/>
+      <w:lvlText w:val="%1."/>
+      <w:lvlJc w:val="left"/>
+      <w:pPr>
+        <w:ind w:left="720" w:hanging="360"/>
+      </w:pPr>
+    </w:lvl>
+    <w:lvl w:ilvl="1" w:tplc="04190019" w:tentative="1">
+      <w:start w:val="1"/>
+      <w:numFmt w:val="lowerLetter"/>
+      <w:lvlText w:val="%2."/>
+      <w:lvlJc w:val="left"/>
+      <w:pPr>
+        <w:ind w:left="1440" w:hanging="360"/>
+      </w:pPr>
+    </w:lvl>
+    <w:lvl w:ilvl="2" w:tplc="0419001B" w:tentative="1">
+      <w:start w:val="1"/>
+      <w:numFmt w:val="lowerRoman"/>
+      <w:lvlText w:val="%3."/>
+      <w:lvlJc w:val="right"/>
+      <w:pPr>
+        <w:ind w:left="2160" w:hanging="180"/>
+      </w:pPr>
+    </w:lvl>
+    <w:lvl w:ilvl="3" w:tplc="0419000F" w:tentative="1">
+      <w:start w:val="1"/>
+      <w:numFmt w:val="decimal"/>
+      <w:lvlText w:val="%4."/>
+      <w:lvlJc w:val="left"/>
+      <w:pPr>
+        <w:ind w:left="2880" w:hanging="360"/>
+      </w:pPr>
+    </w:lvl>
+    <w:lvl w:ilvl="4" w:tplc="04190019" w:tentative="1">
+      <w:start w:val="1"/>
+      <w:numFmt w:val="lowerLetter"/>
+      <w:lvlText w:val="%5."/>
+      <w:lvlJc w:val="left"/>
+      <w:pPr>
+        <w:ind w:left="3600" w:hanging="360"/>
+      </w:pPr>
+    </w:lvl>
+    <w:lvl w:ilvl="5" w:tplc="0419001B" w:tentative="1">
+      <w:start w:val="1"/>
+      <w:numFmt w:val="lowerRoman"/>
+      <w:lvlText w:val="%6."/>
+      <w:lvlJc w:val="right"/>
+      <w:pPr>
+        <w:ind w:left="4320" w:hanging="180"/>
+      </w:pPr>
+    </w:lvl>
+    <w:lvl w:ilvl="6" w:tplc="0419000F" w:tentative="1">
+      <w:start w:val="1"/>
+      <w:numFmt w:val="decimal"/>
+      <w:lvlText w:val="%7."/>
+      <w:lvlJc w:val="left"/>
+      <w:pPr>
+        <w:ind w:left="5040" w:hanging="360"/>
+      </w:pPr>
+    </w:lvl>
+    <w:lvl w:ilvl="7" w:tplc="04190019" w:tentative="1">
+      <w:start w:val="1"/>
+      <w:numFmt w:val="lowerLetter"/>
+      <w:lvlText w:val="%8."/>
+      <w:lvlJc w:val="left"/>
+      <w:pPr>
+        <w:ind w:left="5760" w:hanging="360"/>
+      </w:pPr>
+    </w:lvl>
+    <w:lvl w:ilvl="8" w:tplc="0419001B" w:tentative="1">
+      <w:start w:val="1"/>
+      <w:numFmt w:val="lowerRoman"/>
+      <w:lvlText w:val="%9."/>
+      <w:lvlJc w:val="right"/>
+      <w:pPr>
+        <w:ind w:left="6480" w:hanging="180"/>
+      </w:pPr>
+    </w:lvl>
+  </w:abstractNum>
+  <w:abstractNum w:abstractNumId="5" w15:restartNumberingAfterBreak="0">
     <w:nsid w:val="3BE2017E"/>
     <w:multiLevelType w:val="hybridMultilevel"/>
     <w:tmpl w:val="F61E664E"/>
@@ -5865,7 +5455,7 @@
       </w:rPr>
     </w:lvl>
   </w:abstractNum>
-  <w:abstractNum w:abstractNumId="5" w15:restartNumberingAfterBreak="0">
+  <w:abstractNum w:abstractNumId="6" w15:restartNumberingAfterBreak="0">
     <w:nsid w:val="3E7F5ECC"/>
     <w:multiLevelType w:val="hybridMultilevel"/>
     <w:tmpl w:val="132E09D0"/>
@@ -5951,7 +5541,7 @@
       </w:pPr>
     </w:lvl>
   </w:abstractNum>
-  <w:abstractNum w:abstractNumId="6" w15:restartNumberingAfterBreak="0">
+  <w:abstractNum w:abstractNumId="7" w15:restartNumberingAfterBreak="0">
     <w:nsid w:val="46DB7236"/>
     <w:multiLevelType w:val="hybridMultilevel"/>
     <w:tmpl w:val="BC2EC3B2"/>
@@ -6064,7 +5654,7 @@
       </w:rPr>
     </w:lvl>
   </w:abstractNum>
-  <w:abstractNum w:abstractNumId="7" w15:restartNumberingAfterBreak="0">
+  <w:abstractNum w:abstractNumId="8" w15:restartNumberingAfterBreak="0">
     <w:nsid w:val="50A3449B"/>
     <w:multiLevelType w:val="multilevel"/>
     <w:tmpl w:val="6D54ACB4"/>
@@ -6213,7 +5803,7 @@
       </w:rPr>
     </w:lvl>
   </w:abstractNum>
-  <w:abstractNum w:abstractNumId="8" w15:restartNumberingAfterBreak="0">
+  <w:abstractNum w:abstractNumId="9" w15:restartNumberingAfterBreak="0">
     <w:nsid w:val="56D61CDE"/>
     <w:multiLevelType w:val="multilevel"/>
     <w:tmpl w:val="3F6EC918"/>
@@ -6326,7 +5916,7 @@
       </w:pPr>
     </w:lvl>
   </w:abstractNum>
-  <w:abstractNum w:abstractNumId="9" w15:restartNumberingAfterBreak="0">
+  <w:abstractNum w:abstractNumId="10" w15:restartNumberingAfterBreak="0">
     <w:nsid w:val="59E90C42"/>
     <w:multiLevelType w:val="hybridMultilevel"/>
     <w:tmpl w:val="824E7616"/>
@@ -6439,7 +6029,7 @@
       </w:rPr>
     </w:lvl>
   </w:abstractNum>
-  <w:abstractNum w:abstractNumId="10" w15:restartNumberingAfterBreak="0">
+  <w:abstractNum w:abstractNumId="11" w15:restartNumberingAfterBreak="0">
     <w:nsid w:val="5D74788E"/>
     <w:multiLevelType w:val="multilevel"/>
     <w:tmpl w:val="4C3ADB52"/>
@@ -6588,7 +6178,7 @@
       </w:rPr>
     </w:lvl>
   </w:abstractNum>
-  <w:abstractNum w:abstractNumId="11" w15:restartNumberingAfterBreak="0">
+  <w:abstractNum w:abstractNumId="12" w15:restartNumberingAfterBreak="0">
     <w:nsid w:val="660179B8"/>
     <w:multiLevelType w:val="hybridMultilevel"/>
     <w:tmpl w:val="C25E321E"/>
@@ -6674,7 +6264,7 @@
       </w:pPr>
     </w:lvl>
   </w:abstractNum>
-  <w:abstractNum w:abstractNumId="12" w15:restartNumberingAfterBreak="0">
+  <w:abstractNum w:abstractNumId="13" w15:restartNumberingAfterBreak="0">
     <w:nsid w:val="6F042E0F"/>
     <w:multiLevelType w:val="multilevel"/>
     <w:tmpl w:val="6EE60662"/>
@@ -6823,7 +6413,7 @@
       </w:rPr>
     </w:lvl>
   </w:abstractNum>
-  <w:abstractNum w:abstractNumId="13" w15:restartNumberingAfterBreak="0">
+  <w:abstractNum w:abstractNumId="14" w15:restartNumberingAfterBreak="0">
     <w:nsid w:val="794110B3"/>
     <w:multiLevelType w:val="multilevel"/>
     <w:tmpl w:val="8D546908"/>
@@ -6941,16 +6531,16 @@
     </w:lvl>
   </w:abstractNum>
   <w:num w:numId="1">
+    <w:abstractNumId w:val="14"/>
+  </w:num>
+  <w:num w:numId="2">
+    <w:abstractNumId w:val="8"/>
+  </w:num>
+  <w:num w:numId="3">
     <w:abstractNumId w:val="13"/>
   </w:num>
-  <w:num w:numId="2">
-    <w:abstractNumId w:val="7"/>
-  </w:num>
-  <w:num w:numId="3">
-    <w:abstractNumId w:val="12"/>
-  </w:num>
   <w:num w:numId="4">
-    <w:abstractNumId w:val="10"/>
+    <w:abstractNumId w:val="11"/>
   </w:num>
   <w:num w:numId="5">
     <w:abstractNumId w:val="1"/>
@@ -6959,28 +6549,31 @@
     <w:abstractNumId w:val="3"/>
   </w:num>
   <w:num w:numId="7">
-    <w:abstractNumId w:val="8"/>
+    <w:abstractNumId w:val="9"/>
   </w:num>
   <w:num w:numId="8">
     <w:abstractNumId w:val="2"/>
   </w:num>
   <w:num w:numId="9">
-    <w:abstractNumId w:val="5"/>
+    <w:abstractNumId w:val="6"/>
   </w:num>
   <w:num w:numId="10">
-    <w:abstractNumId w:val="9"/>
+    <w:abstractNumId w:val="10"/>
   </w:num>
   <w:num w:numId="11">
-    <w:abstractNumId w:val="4"/>
+    <w:abstractNumId w:val="5"/>
   </w:num>
   <w:num w:numId="12">
     <w:abstractNumId w:val="0"/>
   </w:num>
   <w:num w:numId="13">
-    <w:abstractNumId w:val="11"/>
+    <w:abstractNumId w:val="12"/>
   </w:num>
   <w:num w:numId="14">
-    <w:abstractNumId w:val="6"/>
+    <w:abstractNumId w:val="7"/>
+  </w:num>
+  <w:num w:numId="15">
+    <w:abstractNumId w:val="4"/>
   </w:num>
 </w:numbering>
 </file>
@@ -7956,7 +7549,6 @@
     <w:basedOn w:val="a"/>
     <w:link w:val="HTML0"/>
     <w:uiPriority w:val="99"/>
-    <w:semiHidden/>
     <w:unhideWhenUsed/>
     <w:rsid w:val="006B4E98"/>
     <w:pPr>
@@ -7994,7 +7586,6 @@
     <w:basedOn w:val="a0"/>
     <w:link w:val="HTML"/>
     <w:uiPriority w:val="99"/>
-    <w:semiHidden/>
     <w:rsid w:val="006B4E98"/>
     <w:rPr>
       <w:rFonts w:ascii="Courier New" w:eastAsia="Times New Roman" w:hAnsi="Courier New" w:cs="Courier New"/>
@@ -8078,6 +7669,50 @@
       <w:i/>
       <w:iCs/>
     </w:rPr>
+  </w:style>
+  <w:style w:type="paragraph" w:styleId="af1">
+    <w:name w:val="header"/>
+    <w:basedOn w:val="a"/>
+    <w:link w:val="af2"/>
+    <w:uiPriority w:val="99"/>
+    <w:unhideWhenUsed/>
+    <w:rsid w:val="00322DC2"/>
+    <w:pPr>
+      <w:tabs>
+        <w:tab w:val="center" w:pos="4677"/>
+        <w:tab w:val="right" w:pos="9355"/>
+      </w:tabs>
+      <w:spacing w:after="0" w:line="240" w:lineRule="auto"/>
+    </w:pPr>
+  </w:style>
+  <w:style w:type="character" w:customStyle="1" w:styleId="af2">
+    <w:name w:val="Верхний колонтитул Знак"/>
+    <w:basedOn w:val="a0"/>
+    <w:link w:val="af1"/>
+    <w:uiPriority w:val="99"/>
+    <w:rsid w:val="00322DC2"/>
+  </w:style>
+  <w:style w:type="paragraph" w:styleId="af3">
+    <w:name w:val="footer"/>
+    <w:basedOn w:val="a"/>
+    <w:link w:val="af4"/>
+    <w:uiPriority w:val="99"/>
+    <w:unhideWhenUsed/>
+    <w:rsid w:val="00322DC2"/>
+    <w:pPr>
+      <w:tabs>
+        <w:tab w:val="center" w:pos="4677"/>
+        <w:tab w:val="right" w:pos="9355"/>
+      </w:tabs>
+      <w:spacing w:after="0" w:line="240" w:lineRule="auto"/>
+    </w:pPr>
+  </w:style>
+  <w:style w:type="character" w:customStyle="1" w:styleId="af4">
+    <w:name w:val="Нижний колонтитул Знак"/>
+    <w:basedOn w:val="a0"/>
+    <w:link w:val="af3"/>
+    <w:uiPriority w:val="99"/>
+    <w:rsid w:val="00322DC2"/>
   </w:style>
 </w:styles>
 </file>
@@ -8382,7 +8017,7 @@
 </file>
 
 <file path=customXml/itemProps1.xml><?xml version="1.0" encoding="utf-8"?>
-<ds:datastoreItem xmlns:ds="http://schemas.openxmlformats.org/officeDocument/2006/customXml" ds:itemID="{15468633-CD6B-46F6-B1D3-BA97B2CA7003}">
+<ds:datastoreItem xmlns:ds="http://schemas.openxmlformats.org/officeDocument/2006/customXml" ds:itemID="{B26C4C5C-6732-4902-B51B-AC000BA9DB19}">
   <ds:schemaRefs>
     <ds:schemaRef ds:uri="http://schemas.openxmlformats.org/officeDocument/2006/bibliography"/>
   </ds:schemaRefs>

</xml_diff>